<commit_message>
Se eliminan extra documentos para evitar duplicados en la información a analizar
</commit_message>
<xml_diff>
--- a/Entrega_actual/Propuesta_SIGPRA_Segunda_Entrega.docx
+++ b/Entrega_actual/Propuesta_SIGPRA_Segunda_Entrega.docx
@@ -211,6 +211,7 @@
         <w:alias w:val="Tabla de contenido"/>
         <w:id w:val="406889558"/>
       </w:sdtPr>
+      <w:sdtEndPr/>
       <w:sdtContent>
         <w:p>
           <w:pPr>
@@ -2568,7 +2569,10 @@
         <w:jc w:val="both"/>
       </w:pPr>
       <w:r>
-        <w:t>La práctica pedagógica es el espacio en el que un estudiante de licenciatura pasa de estudiar la docencia a ejercerla en un aula real, bajo el acompañamiento de un docente asesor de la universidad y de la institución educativa que lo recibe. Es un componente obligatorio del plan de estudios y, al mismo tiempo, un proceso reglado: el Decreto 1075 de 2015 y los lineamientos del Ministerio de Educación Nacional exigen que el programa garantice el cumplimiento de la intensidad horaria, el acompañamiento del practicante y la trazabilidad de todo el proceso, información que después se convierte en evidencia dentro de los procesos de autoevaluación y de acreditación de alta calidad ante el CNA.</w:t>
+        <w:t>La práctica pedagógica es el espacio en el que un estudiante de licenciatura pasa de estudiar la docencia a ejercerla en un aula real, bajo el acompañamiento de un docente asesor de la universidad y de la institución educativa que lo recibe. Es un componente obligatorio del plan de estudios y, al mismo tiempo, un proceso reglado: el Decreto 1075 de 2015 y los lineamientos del Ministerio de Educación Nacional exigen que el programa garantice el cumplimiento de la intensidad horaria, el acompañamiento del pra</w:t>
+      </w:r>
+      <w:r>
+        <w:t>cticante y la trazabilidad de todo el proceso, información que después se convierte en evidencia dentro de los procesos de autoevaluación y de acreditación de alta calidad ante el CNA.</w:t>
       </w:r>
     </w:p>
     <w:p>
@@ -2586,7 +2590,16 @@
         <w:jc w:val="both"/>
       </w:pPr>
       <w:r>
-        <w:t>Este documento corresponde a la primera entrega del Proyecto Integrador y presenta la propuesta de SIGPRA (Software Integral de Gestión de Prácticas Académicas), un aplicativo web para gestionar las prácticas pedagógicas de los programas de licenciatura de la UDI. La entrega comprende la descripción del proceso y del problema, los objetivos, la justificación, el plan de trabajo por fases, la propuesta de arquitectura, el levantamiento de requerimientos, el modelado UML y el modelo de datos. Se trata de una propuesta de lo que se va a construir: las decisiones de tecnología concretas se toman en la fase de diseño, una vez terminado el análisis, y no se comprometen desde los objetivos.</w:t>
+        <w:t xml:space="preserve">Este documento corresponde a la </w:t>
+      </w:r>
+      <w:r>
+        <w:t>segunda</w:t>
+      </w:r>
+      <w:r>
+        <w:t xml:space="preserve"> entrega del Proyecto Integrador y presenta la propuesta de SIGPRA (Software Integral de Gestión de Prácticas Académicas), un aplicativo web para gestionar las prácticas pedagógicas de los programas de licenciatura de la UDI. La entrega comprende la descripción del proceso y del problema, los objetivos, la justificación, el plan de trabajo por fases, la propuesta de arquitectura, el levantamiento de requerimientos, el modelado UML y el modelo de datos. Se trata de una propuesta de lo que se va a construir: </w:t>
+      </w:r>
+      <w:r>
+        <w:t>las decisiones de tecnología concretas se toman en la fase de diseño, una vez terminado el análisis, y no se comprometen desde los objetivos.</w:t>
       </w:r>
     </w:p>
     <w:p>
@@ -2630,7 +2643,10 @@
         <w:jc w:val="both"/>
       </w:pPr>
       <w:r>
-        <w:t>La práctica tiene tres condiciones que la hacen distinta de otras asignaturas. La primera es que el estudiante trabaja por fuera de la universidad, en una institución que no pertenece a ella y con la cual debe existir un convenio vigente. La segunda es que las horas cumplidas tienen valor legal: son las que acreditan el cumplimiento de la intensidad horaria reglamentaria y deben poder demostrarse con soportes. La tercera es que la evaluación no la hace únicamente un profesor frente a un examen, sino un docente asesor que observa al practicante en el aula y aplica una rúbrica.</w:t>
+        <w:t>La práctica tiene tres condiciones que la hacen distinta de otras asignaturas. La primera es que el estudiante trabaja por fuera de la universidad, en una institución que no pertenece a ella y con la cual debe existir un convenio vigente. La segunda es que las horas cumplidas tienen valor legal: son las que acreditan el cumplimiento de la intensidad horaria reglamentaria y deben poder demostrarse con soportes. La tercera es que la evaluación no la hace únicamente un profesor frente a un examen, sino un doce</w:t>
+      </w:r>
+      <w:r>
+        <w:t>nte asesor que observa al practicante en el aula y aplica una rúbrica.</w:t>
       </w:r>
     </w:p>
     <w:p>
@@ -2851,7 +2867,10 @@
         <w:jc w:val="both"/>
       </w:pPr>
       <w:r>
-        <w:t>A partir de lo anterior, el problema se formula así: ¿cómo diseñar y construir un aplicativo web que soporte el proceso completo de las prácticas pedagógicas de los programas de licenciatura de la UDI —programación del periodo, gestión de convenios y plazas, asignación de practicantes, reporte y validación de la práctica ejecutada, seguimiento y evaluación en sitio, y consolidación del estado del proceso—, de manera que todos los actores trabajen sobre la misma información, cada acción crítica quede registrada de forma verificable y los soportes de cada práctica se conserven y puedan recuperarse cuando el programa deba demostrarlos?</w:t>
+        <w:t>A partir de lo anterior, el problema se formula así: ¿cómo diseñar y construir un aplicativo web que soporte el proceso completo de las prácticas pedagógicas de los programas de licenciatura de la UDI —programación del periodo, gestión de convenios y plazas, asignación de practicantes, reporte y validación de la práctica ejecutada, seguimiento y evaluación en sitio, y consolidación del estado del proceso—, de manera que todos los actores trabajen sobre la misma información, cada acción crítica quede registr</w:t>
+      </w:r>
+      <w:r>
+        <w:t>ada de forma verificable y los soportes de cada práctica se conserven y puedan recuperarse cuando el programa deba demostrarlos?</w:t>
       </w:r>
     </w:p>
     <w:p>
@@ -2883,7 +2902,15 @@
         <w:jc w:val="both"/>
       </w:pPr>
       <w:r>
-        <w:t>En consecuencia, el equipo desarrollará los requerimientos RF-01 a RF-05. El requerimiento RF-06, correspondiente a la consolidación de indicadores para los informes de acreditación, queda modelado y documentado pero no se implementará en este proyecto, más allá de una consulta básica del avance de horas por estudiante y por periodo. Tampoco se aborda la integración automática con el sistema de información académica de la universidad: para efectos del proyecto, la información de matrícula y de habilitación del estudiante se cargará en el sistema, y la integración queda planteada como trabajo futuro.</w:t>
+        <w:t xml:space="preserve">En consecuencia, el equipo desarrollará los requerimientos RF-01 a RF-05. El requerimiento RF-06, correspondiente a la consolidación de indicadores para los informes de acreditación, queda modelado y </w:t>
+      </w:r>
+      <w:proofErr w:type="gramStart"/>
+      <w:r>
+        <w:t>documentado</w:t>
+      </w:r>
+      <w:proofErr w:type="gramEnd"/>
+      <w:r>
+        <w:t xml:space="preserve"> pero no se implementará en este proyecto, más allá de una consulta básica del avance de horas por estudiante y por periodo. Tampoco se aborda la integración automática con el sistema de información académica de la universidad: para efectos del proyecto, la información de matrícula y de habilitación del estudiante se cargará en el sistema, y la integración queda planteada como trabajo futuro.</w:t>
       </w:r>
     </w:p>
     <w:p>
@@ -3022,7 +3049,10 @@
         <w:jc w:val="both"/>
       </w:pPr>
       <w:r>
-        <w:t>El coordinador de prácticas de un programa de licenciatura no solo debe garantizar que cada estudiante cumpla las horas reglamentarias; también responde por la trazabilidad del proceso ante la dirección del programa, ante la decanatura y ante los pares académicos que visitan la universidad en los procesos de acreditación. Cuando esa información vive repartida entre hojas de cálculo, correos y carpetas personales, la respuesta a una solicitud de evidencia depende de que la persona que la guardó siga disponible y conserve el archivo.</w:t>
+        <w:t>El coordinador de prácticas de un programa de licenciatura no solo debe garantizar que cada estudiante cumpla las horas reglamentarias; también responde por la trazabilidad del proceso ante la dirección del programa, ante la decanatura y ante los pares académicos que visitan la universidad en los procesos de acreditación. Cuando esa información vive repartida entre hojas de cálculo, correos y carpetas personales, la respuesta a una solicitud de evidencia depende de que la persona que la guardó siga disponib</w:t>
+      </w:r>
+      <w:r>
+        <w:t>le y conserve el archivo.</w:t>
       </w:r>
     </w:p>
     <w:p>
@@ -3031,7 +3061,10 @@
         <w:jc w:val="both"/>
       </w:pPr>
       <w:r>
-        <w:t>Centralizar el proceso en un aplicativo web permite que el coordinador, los docentes asesores y los estudiantes trabajen sobre la misma información, que cada acción crítica quede registrada con su autor y su fecha, y que los soportes de la práctica se conserven en un repositorio institucional y no en equipos personales. Esto no implica que las herramientas actuales estén mal utilizadas: implica que, a medida que crecen el número de practicantes y de convenios, coordinarlas entre varias personas se vuelve costoso en tiempo y frágil frente a auditorías.</w:t>
+        <w:t>Centralizar el proceso en un aplicativo web permite que el coordinador, los docentes asesores y los estudiantes trabajen sobre la misma información, que cada acción crítica quede registrada con su autor y su fecha, y que los soportes de la práctica se conserven en un repositorio institucional y no en equipos personales. Esto no implica que las herramientas actuales estén mal utilizadas: implica que, a medida que crecen el número de practicantes y de convenios, coordinarlas entre varias personas se vuelve co</w:t>
+      </w:r>
+      <w:r>
+        <w:t>stoso en tiempo y frágil frente a auditorías.</w:t>
       </w:r>
     </w:p>
     <w:p>
@@ -3084,7 +3117,10 @@
         <w:jc w:val="both"/>
       </w:pPr>
       <w:r>
-        <w:t>El proyecto se desarrollará siguiendo un modelo de ciclo de vida en cascada. La elección se sustenta en dos condiciones del proyecto: el alcance está delimitado por el calendario académico y no se espera que cambie de forma sustancial durante el semestre, y cada entrega del Proyecto Integrador corresponde de manera natural al cierre de una fase, con productos verificables. Las fases se ejecutan de forma secuencial y cada una toma como entrada el producto aprobado de la anterior; se admite realimentación hacia la fase inmediatamente anterior cuando una verificación detecta una omisión.</w:t>
+        <w:t>El proyecto se desarrollará siguiendo un modelo de ciclo de vida en cascada. La elección se sustenta en dos condiciones del proyecto: el alcance está delimitado por el calendario académico y no se espera que cambie de forma sustancial durante el semestre, y cada entrega del Proyecto Integrador corresponde de manera natural al cierre de una fase, con productos verificables. Las fases se ejecutan de forma secuencial y cada una toma como entrada el producto aprobado de la anterior; se admite realimentación hac</w:t>
+      </w:r>
+      <w:r>
+        <w:t>ia la fase inmediatamente anterior cuando una verificación detecta una omisión.</w:t>
       </w:r>
     </w:p>
     <w:p>
@@ -4013,7 +4049,10 @@
         <w:jc w:val="both"/>
       </w:pPr>
       <w:r>
-        <w:t>El aplicativo se propone como una solución orientada a servicios (SOA) y no como una aplicación monolítica. La razón es funcional antes que técnica: el proceso de práctica agrupa responsabilidades con ciclos de vida distintos. La programación del periodo y los convenios cambian una o dos veces por semestre; el reporte de actividades y la carga de soportes ocurren a diario y concentran la mayor parte de la carga y del volumen de almacenamiento; la consulta consolidada es esporádica pero pesada. Separar estas responsabilidades en servicios permite evolucionarlas y desplegarlas de forma independiente.</w:t>
+        <w:t>El aplicativo se propone como una solución orientada a servicios (SOA) y no como una aplicación monolítica. La razón es funcional antes que técnica: el proceso de práctica agrupa responsabilidades con ciclos de vida distintos. La programación del periodo y los convenios cambian una o dos veces por semestre; el reporte de actividades y la carga de soportes ocurren a diario y concentran la mayor parte de la carga y del volumen de almacenamiento; la consulta consolidada es esporádica pero pesada. Separar estas</w:t>
+      </w:r>
+      <w:r>
+        <w:t xml:space="preserve"> responsabilidades en servicios permite evolucionarlas y desplegarlas de forma independiente.</w:t>
       </w:r>
     </w:p>
     <w:p>
@@ -4729,7 +4768,10 @@
         <w:jc w:val="both"/>
       </w:pPr>
       <w:r>
-        <w:t>La capa de persistencia contempla dos formas de almacenamiento con propósitos distintos. La información transaccional que exige integridad referencial —estudiantes, instituciones, convenios, plazas, asignaciones, periodos, registros de horas y evaluaciones— se administra en una base de datos relacional. La información cuyo contenido varía de un caso a otro —los soportes documentales cargados por el practicante, las bitácoras de las visitas y los eventos de auditoría— se administra en una base de datos documental, y los archivos propiamente dichos se conservan en un almacenamiento de archivos referenciado desde el modelo. La selección de los motores concretos corresponde a la fase de diseño; en esta propuesta se documenta la necesidad, no el producto.</w:t>
+        <w:t>La capa de persistencia contempla dos formas de almacenamiento con propósitos distintos. La información transaccional que exige integridad referencial —estudiantes, instituciones, convenios, plazas, asignaciones, periodos, registros de horas y evaluaciones— se administra en una base de datos relacional. La información cuyo contenido varía de un caso a otro —los soportes documentales cargados por el practicante, las bitácoras de las visitas y los eventos de auditoría— se administra en una base de datos docum</w:t>
+      </w:r>
+      <w:r>
+        <w:t>ental, y los archivos propiamente dichos se conservan en un almacenamiento de archivos referenciado desde el modelo. La selección de los motores concretos corresponde a la fase de diseño; en esta propuesta se documenta la necesidad, no el producto.</w:t>
       </w:r>
     </w:p>
     <w:p>
@@ -5414,7 +5456,10 @@
         <w:jc w:val="both"/>
       </w:pPr>
       <w:r>
-        <w:t>Los requerimientos se formulan sobre el objeto por el cual se construye el software —la gestión de la práctica pedagógica— y no sobre operaciones de mantenimiento de datos. El registro y la actualización de estudiantes, docentes o instituciones se dan por supuestos: son condiciones necesarias para que exista una práctica que gestionar, no el propósito del sistema. Cada requerimiento involucra a más de un actor y describe el flujo de información completo, incluida la información concreta que se registra y las notificaciones que produce.</w:t>
+        <w:t>Los requerimientos se formulan sobre el objeto por el cual se construye el software —la gestión de la práctica pedagógica— y no sobre operaciones de mantenimiento de datos. El registro y la actualización de estudiantes, docentes o instituciones se dan por supuestos: son condiciones necesarias para que exista una práctica que gestionar, no el propósito del sistema. Cada requerimiento involucra a más de un actor y describe el flujo de información completo, incluida la información concreta que se registra y la</w:t>
+      </w:r>
+      <w:r>
+        <w:t>s notificaciones que produce.</w:t>
       </w:r>
     </w:p>
     <w:p>
@@ -5589,7 +5634,14 @@
                 <w:sz w:val="19"/>
                 <w:szCs w:val="19"/>
               </w:rPr>
-              <w:t>El coordinador de prácticas debe poder abrir un periodo de práctica para un programa de licenciatura y un nivel de práctica determinados, dejando definidas las condiciones bajo las cuales se va a ejecutar ese periodo. Al crear el periodo el sistema presenta los periodos de años anteriores del mismo programa, de modo que el coordinador pueda partir de la última configuración utilizada en lugar de capturarla de nuevo. Una vez publicado el periodo, sus reglas quedan visibles para los estudiantes y los docentes asesores vinculados, y toda práctica que se asigne en adelante queda sujeta a ellas. El periodo solo puede cerrarse cuando no existan registros de actividad pendientes de validación; al cerrarlo, el sistema deja el periodo en estado histórico y consultable, pero no admite nuevos registros.</w:t>
+              <w:t>El coordinador de prácticas debe poder abrir un periodo de práctica para un programa de licenciatura y un nivel de práctica determinados, dejando definidas las condiciones bajo las cuales se va a ejecutar ese periodo. Al crear el periodo el sistema presenta los periodos de años anteriores del mismo programa, de modo que el coordinador pueda partir de la última configuración utilizada en lugar de capturarla de nuevo. Una vez publicado el periodo, sus reglas quedan visibles para los estudiantes y los docentes</w:t>
+            </w:r>
+            <w:r>
+              <w:rPr>
+                <w:sz w:val="19"/>
+                <w:szCs w:val="19"/>
+              </w:rPr>
+              <w:t xml:space="preserve"> asesores vinculados, y toda práctica que se asigne en adelante queda sujeta a ellas. El periodo solo puede cerrarse cuando no existan registros de actividad pendientes de validación; al cerrarlo, el sistema deja el periodo en estado histórico y consultable, pero no admite nuevos registros.</w:t>
             </w:r>
           </w:p>
         </w:tc>
@@ -5966,7 +6018,14 @@
                 <w:sz w:val="19"/>
                 <w:szCs w:val="19"/>
               </w:rPr>
-              <w:t>El coordinador debe poder administrar las instituciones educativas con las que el programa mantiene convenio y, dentro de cada convenio, las plazas de práctica que la institución ofrece para el periodo. El sistema mantiene la disponibilidad de cada plaza: al confirmarse una asignación descuenta un cupo y al anularse lo devuelve, de modo que la disponibilidad que ve el coordinador en el momento de asignar corresponde al estado real y no a una consulta previa. Un convenio cuya fecha de vigencia expira pasa a estado inactivo y sus plazas dejan de ofrecerse, sin afectar a las prácticas ya asignadas y en ejecución bajo ese convenio. El coordinador debe poder consultar, en cualquier momento del periodo, qué convenios vencen dentro de los siguientes sesenta días, para gestionar su renovación antes del periodo siguiente.</w:t>
+              <w:t xml:space="preserve">El coordinador debe poder administrar las instituciones educativas con las que el programa mantiene convenio y, dentro de cada convenio, las plazas de práctica que la institución ofrece para el periodo. El sistema mantiene la disponibilidad de cada plaza: al confirmarse una asignación descuenta un cupo y al anularse lo devuelve, de modo que la disponibilidad que ve el coordinador en el momento de asignar corresponde al estado real y no a una consulta previa. Un convenio cuya fecha de vigencia expira pasa a </w:t>
+            </w:r>
+            <w:r>
+              <w:rPr>
+                <w:sz w:val="19"/>
+                <w:szCs w:val="19"/>
+              </w:rPr>
+              <w:t>estado inactivo y sus plazas dejan de ofrecerse, sin afectar a las prácticas ya asignadas y en ejecución bajo ese convenio. El coordinador debe poder consultar, en cualquier momento del periodo, qué convenios vencen dentro de los siguientes sesenta días, para gestionar su renovación antes del periodo siguiente.</w:t>
             </w:r>
           </w:p>
         </w:tc>
@@ -6352,7 +6411,21 @@
                 <w:sz w:val="19"/>
                 <w:szCs w:val="19"/>
               </w:rPr>
-              <w:t>Este es el requerimiento central del sistema. El coordinador debe disponer de la lista de estudiantes habilitados para el periodo abierto, ordenada de manera que aparezcan primero los que aún no tienen asignación. Al seleccionar un estudiante, el sistema muestra las plazas con cupo disponible bajo convenio vigente, indicando para cada una la institución, el municipio, el nivel educativo, la jornada, los cupos libres y el nombre del docente titular; y muestra los docentes asesores disponibles con el número de practicantes que cada uno tiene asignado en el periodo. El coordinador selecciona la plaza y el docente asesor y confirma la vinculación. Al confirmarla, el sistema descuenta el cupo de la plaza, deja la asignación en estado activa con su fecha, y notifica al estudiante, al docente asesor y al contacto de la institución receptora, indicando la institución, la jornada, el docente titular, el docente asesor asignado, las fechas del periodo y la intensidad horaria que debe cumplirse. El estudiante y el docente asesor confirman la recepción desde el sistema. Una asignación puede reasignarse cuando la institución o el estudiante lo solicitan: en ese caso el sistema libera el cupo anterior, descuenta el nuevo, conserva el historial de las horas ya aprobadas y notifica a todos los involucrados el cambio y su motivo.</w:t>
+              <w:t>Este es el requerimiento central del sistema. El coordinador debe disponer de la lista de estudiantes habilitados para el periodo abierto, ordenada de manera que aparezcan primero los que aún no tienen asignación. Al seleccionar un estudiante, el sistema muestra las plazas con cupo disponible bajo convenio vigente, indicando para cada una la institución, el municipio, el nivel educativo, la jornada, los cupos libres y el nombre del docente titular; y muestra los docentes asesores disponibles con el número d</w:t>
+            </w:r>
+            <w:r>
+              <w:rPr>
+                <w:sz w:val="19"/>
+                <w:szCs w:val="19"/>
+              </w:rPr>
+              <w:t>e practicantes que cada uno tiene asignado en el periodo. El coordinador selecciona la plaza y el docente asesor y confirma la vinculación. Al confirmarla, el sistema descuenta el cupo de la plaza, deja la asignación en estado activa con su fecha, y notifica al estudiante, al docente asesor y al contacto de la institución receptora, indicando la institución, la jornada, el docente titular, el docente asesor asignado, las fechas del periodo y la intensidad horaria que debe cumplirse. El estudiante y el docen</w:t>
+            </w:r>
+            <w:r>
+              <w:rPr>
+                <w:sz w:val="19"/>
+                <w:szCs w:val="19"/>
+              </w:rPr>
+              <w:t>te asesor confirman la recepción desde el sistema. Una asignación puede reasignarse cuando la institución o el estudiante lo solicitan: en ese caso el sistema libera el cupo anterior, descuenta el nuevo, conserva el historial de las horas ya aprobadas y notifica a todos los involucrados el cambio y su motivo.</w:t>
             </w:r>
           </w:p>
         </w:tc>
@@ -6730,7 +6803,21 @@
                 <w:sz w:val="19"/>
                 <w:szCs w:val="19"/>
               </w:rPr>
-              <w:t>El estudiante con asignación activa debe poder registrar cada jornada de práctica ejecutada y adjuntarle los soportes que la respaldan. El sistema distingue varios tipos de soporte —planeación de clase, diario de campo, registro de asistencia firmado por la institución y material producido con los estudiantes—, exige los que el periodo haya definido como obligatorios para el tipo de actividad y admite los demás como complementarios. Registrada la actividad, el estudiante la envía a validación y esta queda visible para el docente asesor con sus soportes. El docente asesor revisa el registro y puede aprobarlo, con lo cual las horas se suman al acumulado del estudiante, o devolverlo con una observación que indique qué debe corregirse; en este último caso el registro vuelve al estudiante en estado devuelto, conservando lo ya cargado, para que lo corrija y lo envíe de nuevo. Las actividades enviadas después de la fecha límite del periodo quedan marcadas como extemporáneas y aparecen en la bandeja de novedades del coordinador. El estudiante debe poder consultar en todo momento sus horas aprobadas, las que están en revisión y las que faltan frente a la intensidad exigida.</w:t>
+              <w:t>El estudiante con asignación activa debe poder registrar cada jornada de práctica ejecutada y adjuntarle los soportes que la respaldan. El sistema distingue varios tipos de soporte —planeación de clase, diario de campo, registro de asistencia firmado por la institución y material producido con los estudiantes—, exige los que el periodo haya definido como obligatorios para el tipo de actividad y admite los demás como complementarios. Registrada la actividad, el estudiante la envía a validación y esta queda v</w:t>
+            </w:r>
+            <w:r>
+              <w:rPr>
+                <w:sz w:val="19"/>
+                <w:szCs w:val="19"/>
+              </w:rPr>
+              <w:t xml:space="preserve">isible para el docente asesor con sus soportes. El docente asesor revisa el registro y puede aprobarlo, con lo cual las horas se suman al acumulado del estudiante, o devolverlo con una observación que indique qué debe corregirse; en este último caso el registro vuelve al estudiante en estado devuelto, conservando lo ya cargado, para que lo corrija y lo envíe de nuevo. Las actividades enviadas después de la fecha límite del periodo quedan marcadas como extemporáneas y aparecen en la bandeja de novedades del </w:t>
+            </w:r>
+            <w:r>
+              <w:rPr>
+                <w:sz w:val="19"/>
+                <w:szCs w:val="19"/>
+              </w:rPr>
+              <w:t>coordinador. El estudiante debe poder consultar en todo momento sus horas aprobadas, las que están en revisión y las que faltan frente a la intensidad exigida.</w:t>
             </w:r>
           </w:p>
         </w:tc>
@@ -7129,7 +7216,14 @@
                 <w:szCs w:val="19"/>
               </w:rPr>
               <w:lastRenderedPageBreak/>
-              <w:t>periodo, calificando cada criterio y dejando el comentario que sustenta la calificación. El sistema calcula la nota resultante a partir de los pesos configurados en el periodo y la deja disponible para el estudiante junto con la retroalimentación. Si el practicante no se presenta a la visita, el docente registra la inasistencia con su justificación o sin ella y el sistema notifica al coordinador de prácticas, que es quien decide la actuación correspondiente. El estudiante debe poder consultar el historial de las visitas realizadas, las observaciones recibidas y sus calificaciones por criterio.</w:t>
+              <w:t>periodo, calificando cada criterio y dejando el comentario que sustenta la calificación. El sistema calcula la nota resultante a partir de los pesos configurados en el periodo y la deja disponible para el estudiante junto con la retroalimentación. Si el practicante no se presenta a la visita, el docente registra la inasistencia con su justificación o sin ella y el sistema notifica al coordinador de prácticas, que es quien decide la actuación correspondiente. El estudiante debe poder consultar el historial d</w:t>
+            </w:r>
+            <w:r>
+              <w:rPr>
+                <w:sz w:val="19"/>
+                <w:szCs w:val="19"/>
+              </w:rPr>
+              <w:t>e las visitas realizadas, las observaciones recibidas y sus calificaciones por criterio.</w:t>
             </w:r>
           </w:p>
         </w:tc>
@@ -7507,7 +7601,14 @@
                 <w:sz w:val="19"/>
                 <w:szCs w:val="19"/>
               </w:rPr>
-              <w:t>El coordinador y el director del programa deben poder consultar el estado consolidado de las prácticas de un periodo: cuántos practicantes están asignados y en qué instituciones, el porcentaje de avance de horas de cada uno frente a la intensidad exigida, cuántos alcanzaron el cumplimiento total, las visitas de acompañamiento realizadas frente a las programadas y el estado de vigencia de los convenios utilizados. La consulta debe poder filtrarse por periodo, programa, institución y docente asesor, y exportarse para adjuntarse a los informes de autoevaluación. Cuando la consulta se realiza con registros pendientes de validación, el resultado debe indicar de forma explícita que corresponde a información parcial y cuántos registros están en esa condición, para que no se reporte como definitivo un dato que aún puede cambiar.</w:t>
+              <w:t>El coordinador y el director del programa deben poder consultar el estado consolidado de las prácticas de un periodo: cuántos practicantes están asignados y en qué instituciones, el porcentaje de avance de horas de cada uno frente a la intensidad exigida, cuántos alcanzaron el cumplimiento total, las visitas de acompañamiento realizadas frente a las programadas y el estado de vigencia de los convenios utilizados. La consulta debe poder filtrarse por periodo, programa, institución y docente asesor, y exporta</w:t>
+            </w:r>
+            <w:r>
+              <w:rPr>
+                <w:sz w:val="19"/>
+                <w:szCs w:val="19"/>
+              </w:rPr>
+              <w:t>rse para adjuntarse a los informes de autoevaluación. Cuando la consulta se realiza con registros pendientes de validación, el resultado debe indicar de forma explícita que corresponde a información parcial y cuántos registros están en esa condición, para que no se reporte como definitivo un dato que aún puede cambiar.</w:t>
             </w:r>
           </w:p>
         </w:tc>
@@ -7735,7 +7836,10 @@
         <w:jc w:val="both"/>
       </w:pPr>
       <w:r>
-        <w:t>Un requerimiento no funcional describe una condición de operación que el sistema debe cumplir para que resulte útil en el contexto donde se va a usar, y cada uno de ellos tiene un costo en diseño, en construcción y en infraestructura. Por esa razón solo se incluyen los que responden a una necesidad concreta del proceso de práctica, y no obligaciones implícitas de cualquier sistema (como el cifrado de contraseñas, la verificación de roles o la integridad referencial del modelo de datos), que se recogen como supuestos de diseño en el numeral 6.4. Cada requerimiento se enuncia con la necesidad que lo origina y con la forma en que se verificará.</w:t>
+        <w:t xml:space="preserve">Un requerimiento no funcional describe una condición de operación que el sistema debe cumplir para que resulte útil en el contexto donde se va a usar, y cada uno de ellos tiene un costo en diseño, en construcción y en infraestructura. Por esa razón solo se incluyen los que responden a una necesidad concreta del proceso de práctica, y no obligaciones implícitas de cualquier sistema (como el cifrado de contraseñas, la verificación de roles o la integridad referencial del modelo de datos), que se recogen como </w:t>
+      </w:r>
+      <w:r>
+        <w:t>supuestos de diseño en el numeral 6.4. Cada requerimiento se enuncia con la necesidad que lo origina y con la forma en que se verificará.</w:t>
       </w:r>
     </w:p>
     <w:p>
@@ -9206,7 +9310,23 @@
                 <w:sz w:val="19"/>
                 <w:szCs w:val="19"/>
               </w:rPr>
-              <w:t>Coordinador de prácticas, Director de programa</w:t>
+              <w:t xml:space="preserve">Coordinador de prácticas, </w:t>
+            </w:r>
+            <w:proofErr w:type="gramStart"/>
+            <w:r>
+              <w:rPr>
+                <w:sz w:val="19"/>
+                <w:szCs w:val="19"/>
+              </w:rPr>
+              <w:t>Director</w:t>
+            </w:r>
+            <w:proofErr w:type="gramEnd"/>
+            <w:r>
+              <w:rPr>
+                <w:sz w:val="19"/>
+                <w:szCs w:val="19"/>
+              </w:rPr>
+              <w:t xml:space="preserve"> de programa</w:t>
             </w:r>
           </w:p>
         </w:tc>
@@ -15686,7 +15806,23 @@
                 <w:color w:val="000000"/>
                 <w:szCs w:val="24"/>
               </w:rPr>
-              <w:t>6a.2. El docente adjunta soporte de la visita, como acta, captura o enlace de reunión.</w:t>
+              <w:t xml:space="preserve">6a.2. </w:t>
+            </w:r>
+            <w:proofErr w:type="gramStart"/>
+            <w:r>
+              <w:rPr>
+                <w:color w:val="000000"/>
+                <w:szCs w:val="24"/>
+              </w:rPr>
+              <w:t>El docente adjunta</w:t>
+            </w:r>
+            <w:proofErr w:type="gramEnd"/>
+            <w:r>
+              <w:rPr>
+                <w:color w:val="000000"/>
+                <w:szCs w:val="24"/>
+              </w:rPr>
+              <w:t xml:space="preserve"> soporte de la visita, como acta, captura o enlace de reunión.</w:t>
             </w:r>
           </w:p>
         </w:tc>
@@ -16817,7 +16953,23 @@
                 <w:szCs w:val="24"/>
               </w:rPr>
               <w:lastRenderedPageBreak/>
-              <w:t>disponible, por ejemplo PDF o Excel.</w:t>
+              <w:t xml:space="preserve">disponible, por </w:t>
+            </w:r>
+            <w:proofErr w:type="gramStart"/>
+            <w:r>
+              <w:rPr>
+                <w:color w:val="000000"/>
+                <w:szCs w:val="24"/>
+              </w:rPr>
+              <w:t>ejemplo</w:t>
+            </w:r>
+            <w:proofErr w:type="gramEnd"/>
+            <w:r>
+              <w:rPr>
+                <w:color w:val="000000"/>
+                <w:szCs w:val="24"/>
+              </w:rPr>
+              <w:t xml:space="preserve"> PDF o Excel.</w:t>
             </w:r>
           </w:p>
           <w:p>
@@ -17208,7 +17360,7 @@
         </w:rPr>
         <w:lastRenderedPageBreak/>
         <w:drawing>
-          <wp:inline distT="0" distB="0" distL="0" distR="0" wp14:anchorId="0C890464" wp14:editId="1221ECAE">
+          <wp:inline distT="0" distB="0" distL="0" distR="0" wp14:anchorId="0C890464" wp14:editId="08FF4F71">
             <wp:extent cx="5786120" cy="8229600"/>
             <wp:effectExtent l="0" t="0" r="5080" b="0"/>
             <wp:docPr id="426808427" name="Imagen 2"/>
@@ -17280,7 +17432,10 @@
         <w:jc w:val="both"/>
       </w:pPr>
       <w:r>
-        <w:t>El modelo entidad-relación recoge las entidades del negocio y las relaciones entre ellas, con sus cardinalidades. Conviene aclarar un punto que se corrigió respecto de la versión anterior de este documento: la asignación no es una entidad del modelo conceptual. La asignación es la relación que vincula a un estudiante, una plaza de práctica, un docente asesor y un periodo; lo que ocurre es que esa relación es de muchos a muchos y tiene atributos propios —la fecha en que se realizó, su estado y las horas acumuladas—, y por eso, al convertirla al modelo relacional, da origen a una tabla. Esa distinción es justamente la que permite mostrar de dónde sale cada tabla del modelo relacional.</w:t>
+        <w:t>El modelo entidad-relación recoge las entidades del negocio y las relaciones entre ellas, con sus cardinalidades. Conviene aclarar un punto que se corrigió respecto de la versión anterior de este documento: la asignación no es una entidad del modelo conceptual. La asignación es la relación que vincula a un estudiante, una plaza de práctica, un docente asesor y un periodo; lo que ocurre es que esa relación es de muchos a muchos y tiene atributos propios —la fecha en que se realizó, su estado y las horas acum</w:t>
+      </w:r>
+      <w:r>
+        <w:t>uladas—, y por eso, al convertirla al modelo relacional, da origen a una tabla. Esa distinción es justamente la que permite mostrar de dónde sale cada tabla del modelo relacional.</w:t>
       </w:r>
     </w:p>
     <w:p>
@@ -17317,7 +17472,23 @@
         <w:jc w:val="both"/>
       </w:pPr>
       <w:r>
-        <w:t>Una institución receptora suscribe uno o varios convenios (1:N), y cada convenio ofrece una o varias plazas de práctica (1:N).</w:t>
+        <w:t>Una institución receptora suscribe uno o varios convenios (</w:t>
+      </w:r>
+      <w:proofErr w:type="gramStart"/>
+      <w:r>
+        <w:t>1:N</w:t>
+      </w:r>
+      <w:proofErr w:type="gramEnd"/>
+      <w:r>
+        <w:t>), y cada convenio ofrece una o varias plazas de práctica (</w:t>
+      </w:r>
+      <w:proofErr w:type="gramStart"/>
+      <w:r>
+        <w:t>1:N</w:t>
+      </w:r>
+      <w:proofErr w:type="gramEnd"/>
+      <w:r>
+        <w:t>).</w:t>
       </w:r>
     </w:p>
     <w:p>
@@ -17331,7 +17502,23 @@
         <w:jc w:val="both"/>
       </w:pPr>
       <w:r>
-        <w:t>Un coordinador programa uno o varios periodos de práctica (1:N), y cada periodo define una rúbrica compuesta por varios criterios (1:N).</w:t>
+        <w:t>Un coordinador programa uno o varios periodos de práctica (</w:t>
+      </w:r>
+      <w:proofErr w:type="gramStart"/>
+      <w:r>
+        <w:t>1:N</w:t>
+      </w:r>
+      <w:proofErr w:type="gramEnd"/>
+      <w:r>
+        <w:t>), y cada periodo define una rúbrica compuesta por varios criterios (</w:t>
+      </w:r>
+      <w:proofErr w:type="gramStart"/>
+      <w:r>
+        <w:t>1:N</w:t>
+      </w:r>
+      <w:proofErr w:type="gramEnd"/>
+      <w:r>
+        <w:t>).</w:t>
       </w:r>
     </w:p>
     <w:p>
@@ -17345,7 +17532,15 @@
         <w:jc w:val="both"/>
       </w:pPr>
       <w:r>
-        <w:t>Asignación: relación M:N entre estudiante, plaza, docente asesor y periodo, con los atributos fecha de asignación, estado y horas aprobadas.</w:t>
+        <w:t xml:space="preserve">Asignación: relación </w:t>
+      </w:r>
+      <w:proofErr w:type="gramStart"/>
+      <w:r>
+        <w:t>M:N</w:t>
+      </w:r>
+      <w:proofErr w:type="gramEnd"/>
+      <w:r>
+        <w:t xml:space="preserve"> entre estudiante, plaza, docente asesor y periodo, con los atributos fecha de asignación, estado y horas aprobadas.</w:t>
       </w:r>
     </w:p>
     <w:p>
@@ -17359,7 +17554,23 @@
         <w:jc w:val="both"/>
       </w:pPr>
       <w:r>
-        <w:t>Una asignación registra varias actividades ejecutadas (1:N) y cada actividad soporta uno o varios documentos (1:N).</w:t>
+        <w:t>Una asignación registra varias actividades ejecutadas (</w:t>
+      </w:r>
+      <w:proofErr w:type="gramStart"/>
+      <w:r>
+        <w:t>1:N</w:t>
+      </w:r>
+      <w:proofErr w:type="gramEnd"/>
+      <w:r>
+        <w:t>) y cada actividad soporta uno o varios documentos (</w:t>
+      </w:r>
+      <w:proofErr w:type="gramStart"/>
+      <w:r>
+        <w:t>1:N</w:t>
+      </w:r>
+      <w:proofErr w:type="gramEnd"/>
+      <w:r>
+        <w:t>).</w:t>
       </w:r>
     </w:p>
     <w:p>
@@ -17373,7 +17584,15 @@
         <w:jc w:val="both"/>
       </w:pPr>
       <w:r>
-        <w:t>Una asignación recibe una o varias visitas de acompañamiento (1:N), y una visita puede dar lugar a una evaluación (1:1 opcional).</w:t>
+        <w:t>Una asignación recibe una o varias visitas de acompañamiento (</w:t>
+      </w:r>
+      <w:proofErr w:type="gramStart"/>
+      <w:r>
+        <w:t>1:N</w:t>
+      </w:r>
+      <w:proofErr w:type="gramEnd"/>
+      <w:r>
+        <w:t>), y una visita puede dar lugar a una evaluación (1:1 opcional).</w:t>
       </w:r>
     </w:p>
     <w:p>
@@ -17387,7 +17606,15 @@
         <w:jc w:val="both"/>
       </w:pPr>
       <w:r>
-        <w:t>Una evaluación se detalla en un puntaje por cada criterio de la rúbrica (relación M:N entre evaluación y criterio, con el atributo puntaje).</w:t>
+        <w:t xml:space="preserve">Una evaluación se detalla en un puntaje por cada criterio de la rúbrica (relación </w:t>
+      </w:r>
+      <w:proofErr w:type="gramStart"/>
+      <w:r>
+        <w:t>M:N</w:t>
+      </w:r>
+      <w:proofErr w:type="gramEnd"/>
+      <w:r>
+        <w:t xml:space="preserve"> entre evaluación y criterio, con el atributo puntaje).</w:t>
       </w:r>
     </w:p>
     <w:p>
@@ -17550,12 +17777,6 @@
         <w:gridCol w:w="3560"/>
       </w:tblGrid>
       <w:tr>
-        <w:tblPrEx>
-          <w:tblCellMar>
-            <w:top w:w="0" w:type="dxa"/>
-            <w:bottom w:w="0" w:type="dxa"/>
-          </w:tblCellMar>
-        </w:tblPrEx>
         <w:trPr>
           <w:tblHeader/>
         </w:trPr>
@@ -17687,12 +17908,6 @@
         </w:tc>
       </w:tr>
       <w:tr>
-        <w:tblPrEx>
-          <w:tblCellMar>
-            <w:top w:w="0" w:type="dxa"/>
-            <w:bottom w:w="0" w:type="dxa"/>
-          </w:tblCellMar>
-        </w:tblPrEx>
         <w:tc>
           <w:tcPr>
             <w:tcW w:w="2350" w:type="dxa"/>
@@ -17808,12 +18023,6 @@
         </w:tc>
       </w:tr>
       <w:tr>
-        <w:tblPrEx>
-          <w:tblCellMar>
-            <w:top w:w="0" w:type="dxa"/>
-            <w:bottom w:w="0" w:type="dxa"/>
-          </w:tblCellMar>
-        </w:tblPrEx>
         <w:tc>
           <w:tcPr>
             <w:tcW w:w="2350" w:type="dxa"/>
@@ -17850,13 +18059,23 @@
             </w:tcMar>
           </w:tcPr>
           <w:p>
-            <w:r>
-              <w:rPr>
-                <w:color w:val="000000"/>
-                <w:sz w:val="17"/>
-                <w:szCs w:val="17"/>
-              </w:rPr>
-              <w:t>VARCHAR(120)</w:t>
+            <w:proofErr w:type="gramStart"/>
+            <w:r>
+              <w:rPr>
+                <w:color w:val="000000"/>
+                <w:sz w:val="17"/>
+                <w:szCs w:val="17"/>
+              </w:rPr>
+              <w:t>VARCHAR(</w:t>
+            </w:r>
+            <w:proofErr w:type="gramEnd"/>
+            <w:r>
+              <w:rPr>
+                <w:color w:val="000000"/>
+                <w:sz w:val="17"/>
+                <w:szCs w:val="17"/>
+              </w:rPr>
+              <w:t>120)</w:t>
             </w:r>
           </w:p>
         </w:tc>
@@ -17934,12 +18153,6 @@
         </w:tc>
       </w:tr>
       <w:tr>
-        <w:tblPrEx>
-          <w:tblCellMar>
-            <w:top w:w="0" w:type="dxa"/>
-            <w:bottom w:w="0" w:type="dxa"/>
-          </w:tblCellMar>
-        </w:tblPrEx>
         <w:tc>
           <w:tcPr>
             <w:tcW w:w="2350" w:type="dxa"/>
@@ -17974,13 +18187,23 @@
             </w:tcMar>
           </w:tcPr>
           <w:p>
-            <w:r>
-              <w:rPr>
-                <w:color w:val="000000"/>
-                <w:sz w:val="17"/>
-                <w:szCs w:val="17"/>
-              </w:rPr>
-              <w:t>VARCHAR(255)</w:t>
+            <w:proofErr w:type="gramStart"/>
+            <w:r>
+              <w:rPr>
+                <w:color w:val="000000"/>
+                <w:sz w:val="17"/>
+                <w:szCs w:val="17"/>
+              </w:rPr>
+              <w:t>VARCHAR(</w:t>
+            </w:r>
+            <w:proofErr w:type="gramEnd"/>
+            <w:r>
+              <w:rPr>
+                <w:color w:val="000000"/>
+                <w:sz w:val="17"/>
+                <w:szCs w:val="17"/>
+              </w:rPr>
+              <w:t>255)</w:t>
             </w:r>
           </w:p>
         </w:tc>
@@ -18055,12 +18278,6 @@
         </w:tc>
       </w:tr>
       <w:tr>
-        <w:tblPrEx>
-          <w:tblCellMar>
-            <w:top w:w="0" w:type="dxa"/>
-            <w:bottom w:w="0" w:type="dxa"/>
-          </w:tblCellMar>
-        </w:tblPrEx>
         <w:tc>
           <w:tcPr>
             <w:tcW w:w="2350" w:type="dxa"/>
@@ -18095,13 +18312,23 @@
             </w:tcMar>
           </w:tcPr>
           <w:p>
-            <w:r>
-              <w:rPr>
-                <w:color w:val="000000"/>
-                <w:sz w:val="17"/>
-                <w:szCs w:val="17"/>
-              </w:rPr>
-              <w:t>VARCHAR(30)</w:t>
+            <w:proofErr w:type="gramStart"/>
+            <w:r>
+              <w:rPr>
+                <w:color w:val="000000"/>
+                <w:sz w:val="17"/>
+                <w:szCs w:val="17"/>
+              </w:rPr>
+              <w:t>VARCHAR(</w:t>
+            </w:r>
+            <w:proofErr w:type="gramEnd"/>
+            <w:r>
+              <w:rPr>
+                <w:color w:val="000000"/>
+                <w:sz w:val="17"/>
+                <w:szCs w:val="17"/>
+              </w:rPr>
+              <w:t>30)</w:t>
             </w:r>
           </w:p>
         </w:tc>
@@ -18197,12 +18424,6 @@
         </w:tc>
       </w:tr>
       <w:tr>
-        <w:tblPrEx>
-          <w:tblCellMar>
-            <w:top w:w="0" w:type="dxa"/>
-            <w:bottom w:w="0" w:type="dxa"/>
-          </w:tblCellMar>
-        </w:tblPrEx>
         <w:tc>
           <w:tcPr>
             <w:tcW w:w="2350" w:type="dxa"/>
@@ -18235,13 +18456,23 @@
             </w:tcMar>
           </w:tcPr>
           <w:p>
-            <w:r>
-              <w:rPr>
-                <w:color w:val="000000"/>
-                <w:sz w:val="17"/>
-                <w:szCs w:val="17"/>
-              </w:rPr>
-              <w:t>VARCHAR(20)</w:t>
+            <w:proofErr w:type="gramStart"/>
+            <w:r>
+              <w:rPr>
+                <w:color w:val="000000"/>
+                <w:sz w:val="17"/>
+                <w:szCs w:val="17"/>
+              </w:rPr>
+              <w:t>VARCHAR(</w:t>
+            </w:r>
+            <w:proofErr w:type="gramEnd"/>
+            <w:r>
+              <w:rPr>
+                <w:color w:val="000000"/>
+                <w:sz w:val="17"/>
+                <w:szCs w:val="17"/>
+              </w:rPr>
+              <w:t>20)</w:t>
             </w:r>
           </w:p>
         </w:tc>
@@ -18310,7 +18541,25 @@
                 <w:sz w:val="17"/>
                 <w:szCs w:val="17"/>
               </w:rPr>
-              <w:t>activo | inactivo. Un usuario inactivo conserva su historial pero no puede autenticarse.</w:t>
+              <w:t xml:space="preserve">activo | inactivo. Un usuario inactivo conserva su </w:t>
+            </w:r>
+            <w:proofErr w:type="gramStart"/>
+            <w:r>
+              <w:rPr>
+                <w:color w:val="000000"/>
+                <w:sz w:val="17"/>
+                <w:szCs w:val="17"/>
+              </w:rPr>
+              <w:t>historial</w:t>
+            </w:r>
+            <w:proofErr w:type="gramEnd"/>
+            <w:r>
+              <w:rPr>
+                <w:color w:val="000000"/>
+                <w:sz w:val="17"/>
+                <w:szCs w:val="17"/>
+              </w:rPr>
+              <w:t xml:space="preserve"> pero no puede autenticarse.</w:t>
             </w:r>
           </w:p>
         </w:tc>
@@ -18370,12 +18619,6 @@
         <w:gridCol w:w="3560"/>
       </w:tblGrid>
       <w:tr>
-        <w:tblPrEx>
-          <w:tblCellMar>
-            <w:top w:w="0" w:type="dxa"/>
-            <w:bottom w:w="0" w:type="dxa"/>
-          </w:tblCellMar>
-        </w:tblPrEx>
         <w:trPr>
           <w:tblHeader/>
         </w:trPr>
@@ -18507,12 +18750,6 @@
         </w:tc>
       </w:tr>
       <w:tr>
-        <w:tblPrEx>
-          <w:tblCellMar>
-            <w:top w:w="0" w:type="dxa"/>
-            <w:bottom w:w="0" w:type="dxa"/>
-          </w:tblCellMar>
-        </w:tblPrEx>
         <w:tc>
           <w:tcPr>
             <w:tcW w:w="2350" w:type="dxa"/>
@@ -18628,12 +18865,6 @@
         </w:tc>
       </w:tr>
       <w:tr>
-        <w:tblPrEx>
-          <w:tblCellMar>
-            <w:top w:w="0" w:type="dxa"/>
-            <w:bottom w:w="0" w:type="dxa"/>
-          </w:tblCellMar>
-        </w:tblPrEx>
         <w:tc>
           <w:tcPr>
             <w:tcW w:w="2350" w:type="dxa"/>
@@ -18754,12 +18985,6 @@
         </w:tc>
       </w:tr>
       <w:tr>
-        <w:tblPrEx>
-          <w:tblCellMar>
-            <w:top w:w="0" w:type="dxa"/>
-            <w:bottom w:w="0" w:type="dxa"/>
-          </w:tblCellMar>
-        </w:tblPrEx>
         <w:tc>
           <w:tcPr>
             <w:tcW w:w="2350" w:type="dxa"/>
@@ -18794,13 +19019,23 @@
             </w:tcMar>
           </w:tcPr>
           <w:p>
-            <w:r>
-              <w:rPr>
-                <w:color w:val="000000"/>
-                <w:sz w:val="17"/>
-                <w:szCs w:val="17"/>
-              </w:rPr>
-              <w:t>VARCHAR(20)</w:t>
+            <w:proofErr w:type="gramStart"/>
+            <w:r>
+              <w:rPr>
+                <w:color w:val="000000"/>
+                <w:sz w:val="17"/>
+                <w:szCs w:val="17"/>
+              </w:rPr>
+              <w:t>VARCHAR(</w:t>
+            </w:r>
+            <w:proofErr w:type="gramEnd"/>
+            <w:r>
+              <w:rPr>
+                <w:color w:val="000000"/>
+                <w:sz w:val="17"/>
+                <w:szCs w:val="17"/>
+              </w:rPr>
+              <w:t>20)</w:t>
             </w:r>
           </w:p>
         </w:tc>
@@ -18875,12 +19110,6 @@
         </w:tc>
       </w:tr>
       <w:tr>
-        <w:tblPrEx>
-          <w:tblCellMar>
-            <w:top w:w="0" w:type="dxa"/>
-            <w:bottom w:w="0" w:type="dxa"/>
-          </w:tblCellMar>
-        </w:tblPrEx>
         <w:tc>
           <w:tcPr>
             <w:tcW w:w="2350" w:type="dxa"/>
@@ -18915,13 +19144,23 @@
             </w:tcMar>
           </w:tcPr>
           <w:p>
-            <w:r>
-              <w:rPr>
-                <w:color w:val="000000"/>
-                <w:sz w:val="17"/>
-                <w:szCs w:val="17"/>
-              </w:rPr>
-              <w:t>VARCHAR(20)</w:t>
+            <w:proofErr w:type="gramStart"/>
+            <w:r>
+              <w:rPr>
+                <w:color w:val="000000"/>
+                <w:sz w:val="17"/>
+                <w:szCs w:val="17"/>
+              </w:rPr>
+              <w:t>VARCHAR(</w:t>
+            </w:r>
+            <w:proofErr w:type="gramEnd"/>
+            <w:r>
+              <w:rPr>
+                <w:color w:val="000000"/>
+                <w:sz w:val="17"/>
+                <w:szCs w:val="17"/>
+              </w:rPr>
+              <w:t>20)</w:t>
             </w:r>
           </w:p>
         </w:tc>
@@ -18999,12 +19238,6 @@
         </w:tc>
       </w:tr>
       <w:tr>
-        <w:tblPrEx>
-          <w:tblCellMar>
-            <w:top w:w="0" w:type="dxa"/>
-            <w:bottom w:w="0" w:type="dxa"/>
-          </w:tblCellMar>
-        </w:tblPrEx>
         <w:tc>
           <w:tcPr>
             <w:tcW w:w="2350" w:type="dxa"/>
@@ -19038,13 +19271,23 @@
             </w:tcMar>
           </w:tcPr>
           <w:p>
-            <w:r>
-              <w:rPr>
-                <w:color w:val="000000"/>
-                <w:sz w:val="17"/>
-                <w:szCs w:val="17"/>
-              </w:rPr>
-              <w:t>VARCHAR(120)</w:t>
+            <w:proofErr w:type="gramStart"/>
+            <w:r>
+              <w:rPr>
+                <w:color w:val="000000"/>
+                <w:sz w:val="17"/>
+                <w:szCs w:val="17"/>
+              </w:rPr>
+              <w:t>VARCHAR(</w:t>
+            </w:r>
+            <w:proofErr w:type="gramEnd"/>
+            <w:r>
+              <w:rPr>
+                <w:color w:val="000000"/>
+                <w:sz w:val="17"/>
+                <w:szCs w:val="17"/>
+              </w:rPr>
+              <w:t>120)</w:t>
             </w:r>
           </w:p>
         </w:tc>
@@ -19119,12 +19362,6 @@
         </w:tc>
       </w:tr>
       <w:tr>
-        <w:tblPrEx>
-          <w:tblCellMar>
-            <w:top w:w="0" w:type="dxa"/>
-            <w:bottom w:w="0" w:type="dxa"/>
-          </w:tblCellMar>
-        </w:tblPrEx>
         <w:tc>
           <w:tcPr>
             <w:tcW w:w="2350" w:type="dxa"/>
@@ -19159,13 +19396,23 @@
             </w:tcMar>
           </w:tcPr>
           <w:p>
-            <w:r>
-              <w:rPr>
-                <w:color w:val="000000"/>
-                <w:sz w:val="17"/>
-                <w:szCs w:val="17"/>
-              </w:rPr>
-              <w:t>VARCHAR(80)</w:t>
+            <w:proofErr w:type="gramStart"/>
+            <w:r>
+              <w:rPr>
+                <w:color w:val="000000"/>
+                <w:sz w:val="17"/>
+                <w:szCs w:val="17"/>
+              </w:rPr>
+              <w:t>VARCHAR(</w:t>
+            </w:r>
+            <w:proofErr w:type="gramEnd"/>
+            <w:r>
+              <w:rPr>
+                <w:color w:val="000000"/>
+                <w:sz w:val="17"/>
+                <w:szCs w:val="17"/>
+              </w:rPr>
+              <w:t>80)</w:t>
             </w:r>
           </w:p>
         </w:tc>
@@ -19243,12 +19490,6 @@
         </w:tc>
       </w:tr>
       <w:tr>
-        <w:tblPrEx>
-          <w:tblCellMar>
-            <w:top w:w="0" w:type="dxa"/>
-            <w:bottom w:w="0" w:type="dxa"/>
-          </w:tblCellMar>
-        </w:tblPrEx>
         <w:tc>
           <w:tcPr>
             <w:tcW w:w="2350" w:type="dxa"/>
@@ -19362,12 +19603,6 @@
         </w:tc>
       </w:tr>
       <w:tr>
-        <w:tblPrEx>
-          <w:tblCellMar>
-            <w:top w:w="0" w:type="dxa"/>
-            <w:bottom w:w="0" w:type="dxa"/>
-          </w:tblCellMar>
-        </w:tblPrEx>
         <w:tc>
           <w:tcPr>
             <w:tcW w:w="2350" w:type="dxa"/>
@@ -19404,13 +19639,23 @@
             </w:tcMar>
           </w:tcPr>
           <w:p>
-            <w:r>
-              <w:rPr>
-                <w:color w:val="000000"/>
-                <w:sz w:val="17"/>
-                <w:szCs w:val="17"/>
-              </w:rPr>
-              <w:t>VARCHAR(20)</w:t>
+            <w:proofErr w:type="gramStart"/>
+            <w:r>
+              <w:rPr>
+                <w:color w:val="000000"/>
+                <w:sz w:val="17"/>
+                <w:szCs w:val="17"/>
+              </w:rPr>
+              <w:t>VARCHAR(</w:t>
+            </w:r>
+            <w:proofErr w:type="gramEnd"/>
+            <w:r>
+              <w:rPr>
+                <w:color w:val="000000"/>
+                <w:sz w:val="17"/>
+                <w:szCs w:val="17"/>
+              </w:rPr>
+              <w:t>20)</w:t>
             </w:r>
           </w:p>
         </w:tc>
@@ -19542,12 +19787,6 @@
         <w:gridCol w:w="3560"/>
       </w:tblGrid>
       <w:tr>
-        <w:tblPrEx>
-          <w:tblCellMar>
-            <w:top w:w="0" w:type="dxa"/>
-            <w:bottom w:w="0" w:type="dxa"/>
-          </w:tblCellMar>
-        </w:tblPrEx>
         <w:trPr>
           <w:tblHeader/>
         </w:trPr>
@@ -19679,12 +19918,6 @@
         </w:tc>
       </w:tr>
       <w:tr>
-        <w:tblPrEx>
-          <w:tblCellMar>
-            <w:top w:w="0" w:type="dxa"/>
-            <w:bottom w:w="0" w:type="dxa"/>
-          </w:tblCellMar>
-        </w:tblPrEx>
         <w:tc>
           <w:tcPr>
             <w:tcW w:w="2350" w:type="dxa"/>
@@ -19800,12 +20033,6 @@
         </w:tc>
       </w:tr>
       <w:tr>
-        <w:tblPrEx>
-          <w:tblCellMar>
-            <w:top w:w="0" w:type="dxa"/>
-            <w:bottom w:w="0" w:type="dxa"/>
-          </w:tblCellMar>
-        </w:tblPrEx>
         <w:tc>
           <w:tcPr>
             <w:tcW w:w="2350" w:type="dxa"/>
@@ -19926,12 +20153,6 @@
         </w:tc>
       </w:tr>
       <w:tr>
-        <w:tblPrEx>
-          <w:tblCellMar>
-            <w:top w:w="0" w:type="dxa"/>
-            <w:bottom w:w="0" w:type="dxa"/>
-          </w:tblCellMar>
-        </w:tblPrEx>
         <w:tc>
           <w:tcPr>
             <w:tcW w:w="2350" w:type="dxa"/>
@@ -19964,13 +20185,23 @@
             </w:tcMar>
           </w:tcPr>
           <w:p>
-            <w:r>
-              <w:rPr>
-                <w:color w:val="000000"/>
-                <w:sz w:val="17"/>
-                <w:szCs w:val="17"/>
-              </w:rPr>
-              <w:t>VARCHAR(20)</w:t>
+            <w:proofErr w:type="gramStart"/>
+            <w:r>
+              <w:rPr>
+                <w:color w:val="000000"/>
+                <w:sz w:val="17"/>
+                <w:szCs w:val="17"/>
+              </w:rPr>
+              <w:t>VARCHAR(</w:t>
+            </w:r>
+            <w:proofErr w:type="gramEnd"/>
+            <w:r>
+              <w:rPr>
+                <w:color w:val="000000"/>
+                <w:sz w:val="17"/>
+                <w:szCs w:val="17"/>
+              </w:rPr>
+              <w:t>20)</w:t>
             </w:r>
           </w:p>
         </w:tc>
@@ -20045,12 +20276,6 @@
         </w:tc>
       </w:tr>
       <w:tr>
-        <w:tblPrEx>
-          <w:tblCellMar>
-            <w:top w:w="0" w:type="dxa"/>
-            <w:bottom w:w="0" w:type="dxa"/>
-          </w:tblCellMar>
-        </w:tblPrEx>
         <w:tc>
           <w:tcPr>
             <w:tcW w:w="2350" w:type="dxa"/>
@@ -20085,13 +20310,23 @@
             </w:tcMar>
           </w:tcPr>
           <w:p>
-            <w:r>
-              <w:rPr>
-                <w:color w:val="000000"/>
-                <w:sz w:val="17"/>
-                <w:szCs w:val="17"/>
-              </w:rPr>
-              <w:t>VARCHAR(120)</w:t>
+            <w:proofErr w:type="gramStart"/>
+            <w:r>
+              <w:rPr>
+                <w:color w:val="000000"/>
+                <w:sz w:val="17"/>
+                <w:szCs w:val="17"/>
+              </w:rPr>
+              <w:t>VARCHAR(</w:t>
+            </w:r>
+            <w:proofErr w:type="gramEnd"/>
+            <w:r>
+              <w:rPr>
+                <w:color w:val="000000"/>
+                <w:sz w:val="17"/>
+                <w:szCs w:val="17"/>
+              </w:rPr>
+              <w:t>120)</w:t>
             </w:r>
           </w:p>
         </w:tc>
@@ -20169,12 +20404,6 @@
         </w:tc>
       </w:tr>
       <w:tr>
-        <w:tblPrEx>
-          <w:tblCellMar>
-            <w:top w:w="0" w:type="dxa"/>
-            <w:bottom w:w="0" w:type="dxa"/>
-          </w:tblCellMar>
-        </w:tblPrEx>
         <w:tc>
           <w:tcPr>
             <w:tcW w:w="2350" w:type="dxa"/>
@@ -20344,12 +20573,6 @@
         <w:gridCol w:w="3560"/>
       </w:tblGrid>
       <w:tr>
-        <w:tblPrEx>
-          <w:tblCellMar>
-            <w:top w:w="0" w:type="dxa"/>
-            <w:bottom w:w="0" w:type="dxa"/>
-          </w:tblCellMar>
-        </w:tblPrEx>
         <w:trPr>
           <w:tblHeader/>
         </w:trPr>
@@ -20481,12 +20704,6 @@
         </w:tc>
       </w:tr>
       <w:tr>
-        <w:tblPrEx>
-          <w:tblCellMar>
-            <w:top w:w="0" w:type="dxa"/>
-            <w:bottom w:w="0" w:type="dxa"/>
-          </w:tblCellMar>
-        </w:tblPrEx>
         <w:tc>
           <w:tcPr>
             <w:tcW w:w="2350" w:type="dxa"/>
@@ -20602,12 +20819,6 @@
         </w:tc>
       </w:tr>
       <w:tr>
-        <w:tblPrEx>
-          <w:tblCellMar>
-            <w:top w:w="0" w:type="dxa"/>
-            <w:bottom w:w="0" w:type="dxa"/>
-          </w:tblCellMar>
-        </w:tblPrEx>
         <w:tc>
           <w:tcPr>
             <w:tcW w:w="2350" w:type="dxa"/>
@@ -20728,12 +20939,6 @@
         </w:tc>
       </w:tr>
       <w:tr>
-        <w:tblPrEx>
-          <w:tblCellMar>
-            <w:top w:w="0" w:type="dxa"/>
-            <w:bottom w:w="0" w:type="dxa"/>
-          </w:tblCellMar>
-        </w:tblPrEx>
         <w:tc>
           <w:tcPr>
             <w:tcW w:w="2350" w:type="dxa"/>
@@ -20766,13 +20971,23 @@
             </w:tcMar>
           </w:tcPr>
           <w:p>
-            <w:r>
-              <w:rPr>
-                <w:color w:val="000000"/>
-                <w:sz w:val="17"/>
-                <w:szCs w:val="17"/>
-              </w:rPr>
-              <w:t>VARCHAR(20)</w:t>
+            <w:proofErr w:type="gramStart"/>
+            <w:r>
+              <w:rPr>
+                <w:color w:val="000000"/>
+                <w:sz w:val="17"/>
+                <w:szCs w:val="17"/>
+              </w:rPr>
+              <w:t>VARCHAR(</w:t>
+            </w:r>
+            <w:proofErr w:type="gramEnd"/>
+            <w:r>
+              <w:rPr>
+                <w:color w:val="000000"/>
+                <w:sz w:val="17"/>
+                <w:szCs w:val="17"/>
+              </w:rPr>
+              <w:t>20)</w:t>
             </w:r>
           </w:p>
         </w:tc>
@@ -20847,12 +21062,6 @@
         </w:tc>
       </w:tr>
       <w:tr>
-        <w:tblPrEx>
-          <w:tblCellMar>
-            <w:top w:w="0" w:type="dxa"/>
-            <w:bottom w:w="0" w:type="dxa"/>
-          </w:tblCellMar>
-        </w:tblPrEx>
         <w:tc>
           <w:tcPr>
             <w:tcW w:w="2350" w:type="dxa"/>
@@ -20887,13 +21096,23 @@
             </w:tcMar>
           </w:tcPr>
           <w:p>
-            <w:r>
-              <w:rPr>
-                <w:color w:val="000000"/>
-                <w:sz w:val="17"/>
-                <w:szCs w:val="17"/>
-              </w:rPr>
-              <w:t>VARCHAR(120)</w:t>
+            <w:proofErr w:type="gramStart"/>
+            <w:r>
+              <w:rPr>
+                <w:color w:val="000000"/>
+                <w:sz w:val="17"/>
+                <w:szCs w:val="17"/>
+              </w:rPr>
+              <w:t>VARCHAR(</w:t>
+            </w:r>
+            <w:proofErr w:type="gramEnd"/>
+            <w:r>
+              <w:rPr>
+                <w:color w:val="000000"/>
+                <w:sz w:val="17"/>
+                <w:szCs w:val="17"/>
+              </w:rPr>
+              <w:t>120)</w:t>
             </w:r>
           </w:p>
         </w:tc>
@@ -20971,12 +21190,6 @@
         </w:tc>
       </w:tr>
       <w:tr>
-        <w:tblPrEx>
-          <w:tblCellMar>
-            <w:top w:w="0" w:type="dxa"/>
-            <w:bottom w:w="0" w:type="dxa"/>
-          </w:tblCellMar>
-        </w:tblPrEx>
         <w:tc>
           <w:tcPr>
             <w:tcW w:w="2350" w:type="dxa"/>
@@ -21011,13 +21224,23 @@
             </w:tcMar>
           </w:tcPr>
           <w:p>
-            <w:r>
-              <w:rPr>
-                <w:color w:val="000000"/>
-                <w:sz w:val="17"/>
-                <w:szCs w:val="17"/>
-              </w:rPr>
-              <w:t>VARCHAR(80)</w:t>
+            <w:proofErr w:type="gramStart"/>
+            <w:r>
+              <w:rPr>
+                <w:color w:val="000000"/>
+                <w:sz w:val="17"/>
+                <w:szCs w:val="17"/>
+              </w:rPr>
+              <w:t>VARCHAR(</w:t>
+            </w:r>
+            <w:proofErr w:type="gramEnd"/>
+            <w:r>
+              <w:rPr>
+                <w:color w:val="000000"/>
+                <w:sz w:val="17"/>
+                <w:szCs w:val="17"/>
+              </w:rPr>
+              <w:t>80)</w:t>
             </w:r>
           </w:p>
         </w:tc>
@@ -21146,12 +21369,6 @@
         <w:gridCol w:w="3560"/>
       </w:tblGrid>
       <w:tr>
-        <w:tblPrEx>
-          <w:tblCellMar>
-            <w:top w:w="0" w:type="dxa"/>
-            <w:bottom w:w="0" w:type="dxa"/>
-          </w:tblCellMar>
-        </w:tblPrEx>
         <w:trPr>
           <w:tblHeader/>
         </w:trPr>
@@ -21283,12 +21500,6 @@
         </w:tc>
       </w:tr>
       <w:tr>
-        <w:tblPrEx>
-          <w:tblCellMar>
-            <w:top w:w="0" w:type="dxa"/>
-            <w:bottom w:w="0" w:type="dxa"/>
-          </w:tblCellMar>
-        </w:tblPrEx>
         <w:tc>
           <w:tcPr>
             <w:tcW w:w="2350" w:type="dxa"/>
@@ -21404,12 +21615,6 @@
         </w:tc>
       </w:tr>
       <w:tr>
-        <w:tblPrEx>
-          <w:tblCellMar>
-            <w:top w:w="0" w:type="dxa"/>
-            <w:bottom w:w="0" w:type="dxa"/>
-          </w:tblCellMar>
-        </w:tblPrEx>
         <w:tc>
           <w:tcPr>
             <w:tcW w:w="2350" w:type="dxa"/>
@@ -21530,12 +21735,6 @@
         </w:tc>
       </w:tr>
       <w:tr>
-        <w:tblPrEx>
-          <w:tblCellMar>
-            <w:top w:w="0" w:type="dxa"/>
-            <w:bottom w:w="0" w:type="dxa"/>
-          </w:tblCellMar>
-        </w:tblPrEx>
         <w:tc>
           <w:tcPr>
             <w:tcW w:w="2350" w:type="dxa"/>
@@ -21568,13 +21767,23 @@
             </w:tcMar>
           </w:tcPr>
           <w:p>
-            <w:r>
-              <w:rPr>
-                <w:color w:val="000000"/>
-                <w:sz w:val="17"/>
-                <w:szCs w:val="17"/>
-              </w:rPr>
-              <w:t>VARCHAR(80)</w:t>
+            <w:proofErr w:type="gramStart"/>
+            <w:r>
+              <w:rPr>
+                <w:color w:val="000000"/>
+                <w:sz w:val="17"/>
+                <w:szCs w:val="17"/>
+              </w:rPr>
+              <w:t>VARCHAR(</w:t>
+            </w:r>
+            <w:proofErr w:type="gramEnd"/>
+            <w:r>
+              <w:rPr>
+                <w:color w:val="000000"/>
+                <w:sz w:val="17"/>
+                <w:szCs w:val="17"/>
+              </w:rPr>
+              <w:t>80)</w:t>
             </w:r>
           </w:p>
         </w:tc>
@@ -21649,12 +21858,6 @@
         </w:tc>
       </w:tr>
       <w:tr>
-        <w:tblPrEx>
-          <w:tblCellMar>
-            <w:top w:w="0" w:type="dxa"/>
-            <w:bottom w:w="0" w:type="dxa"/>
-          </w:tblCellMar>
-        </w:tblPrEx>
         <w:tc>
           <w:tcPr>
             <w:tcW w:w="2350" w:type="dxa"/>
@@ -21691,13 +21894,23 @@
             </w:tcMar>
           </w:tcPr>
           <w:p>
-            <w:r>
-              <w:rPr>
-                <w:color w:val="000000"/>
-                <w:sz w:val="17"/>
-                <w:szCs w:val="17"/>
-              </w:rPr>
-              <w:t>VARCHAR(40)</w:t>
+            <w:proofErr w:type="gramStart"/>
+            <w:r>
+              <w:rPr>
+                <w:color w:val="000000"/>
+                <w:sz w:val="17"/>
+                <w:szCs w:val="17"/>
+              </w:rPr>
+              <w:t>VARCHAR(</w:t>
+            </w:r>
+            <w:proofErr w:type="gramEnd"/>
+            <w:r>
+              <w:rPr>
+                <w:color w:val="000000"/>
+                <w:sz w:val="17"/>
+                <w:szCs w:val="17"/>
+              </w:rPr>
+              <w:t>40)</w:t>
             </w:r>
           </w:p>
         </w:tc>
@@ -21775,12 +21988,6 @@
         </w:tc>
       </w:tr>
       <w:tr>
-        <w:tblPrEx>
-          <w:tblCellMar>
-            <w:top w:w="0" w:type="dxa"/>
-            <w:bottom w:w="0" w:type="dxa"/>
-          </w:tblCellMar>
-        </w:tblPrEx>
         <w:tc>
           <w:tcPr>
             <w:tcW w:w="2350" w:type="dxa"/>
@@ -21896,12 +22103,6 @@
         </w:tc>
       </w:tr>
       <w:tr>
-        <w:tblPrEx>
-          <w:tblCellMar>
-            <w:top w:w="0" w:type="dxa"/>
-            <w:bottom w:w="0" w:type="dxa"/>
-          </w:tblCellMar>
-        </w:tblPrEx>
         <w:tc>
           <w:tcPr>
             <w:tcW w:w="2350" w:type="dxa"/>
@@ -22020,12 +22221,6 @@
         </w:tc>
       </w:tr>
       <w:tr>
-        <w:tblPrEx>
-          <w:tblCellMar>
-            <w:top w:w="0" w:type="dxa"/>
-            <w:bottom w:w="0" w:type="dxa"/>
-          </w:tblCellMar>
-        </w:tblPrEx>
         <w:tc>
           <w:tcPr>
             <w:tcW w:w="2350" w:type="dxa"/>
@@ -22141,12 +22336,6 @@
         </w:tc>
       </w:tr>
       <w:tr>
-        <w:tblPrEx>
-          <w:tblCellMar>
-            <w:top w:w="0" w:type="dxa"/>
-            <w:bottom w:w="0" w:type="dxa"/>
-          </w:tblCellMar>
-        </w:tblPrEx>
         <w:tc>
           <w:tcPr>
             <w:tcW w:w="2350" w:type="dxa"/>
@@ -22267,12 +22456,6 @@
         </w:tc>
       </w:tr>
       <w:tr>
-        <w:tblPrEx>
-          <w:tblCellMar>
-            <w:top w:w="0" w:type="dxa"/>
-            <w:bottom w:w="0" w:type="dxa"/>
-          </w:tblCellMar>
-        </w:tblPrEx>
         <w:tc>
           <w:tcPr>
             <w:tcW w:w="2350" w:type="dxa"/>
@@ -22389,12 +22572,6 @@
         </w:tc>
       </w:tr>
       <w:tr>
-        <w:tblPrEx>
-          <w:tblCellMar>
-            <w:top w:w="0" w:type="dxa"/>
-            <w:bottom w:w="0" w:type="dxa"/>
-          </w:tblCellMar>
-        </w:tblPrEx>
         <w:tc>
           <w:tcPr>
             <w:tcW w:w="2350" w:type="dxa"/>
@@ -22533,12 +22710,6 @@
         </w:tc>
       </w:tr>
       <w:tr>
-        <w:tblPrEx>
-          <w:tblCellMar>
-            <w:top w:w="0" w:type="dxa"/>
-            <w:bottom w:w="0" w:type="dxa"/>
-          </w:tblCellMar>
-        </w:tblPrEx>
         <w:tc>
           <w:tcPr>
             <w:tcW w:w="2350" w:type="dxa"/>
@@ -22654,12 +22825,6 @@
         </w:tc>
       </w:tr>
       <w:tr>
-        <w:tblPrEx>
-          <w:tblCellMar>
-            <w:top w:w="0" w:type="dxa"/>
-            <w:bottom w:w="0" w:type="dxa"/>
-          </w:tblCellMar>
-        </w:tblPrEx>
         <w:tc>
           <w:tcPr>
             <w:tcW w:w="2350" w:type="dxa"/>
@@ -22694,13 +22859,23 @@
             </w:tcMar>
           </w:tcPr>
           <w:p>
-            <w:r>
-              <w:rPr>
-                <w:color w:val="000000"/>
-                <w:sz w:val="17"/>
-                <w:szCs w:val="17"/>
-              </w:rPr>
-              <w:t>VARCHAR(20)</w:t>
+            <w:proofErr w:type="gramStart"/>
+            <w:r>
+              <w:rPr>
+                <w:color w:val="000000"/>
+                <w:sz w:val="17"/>
+                <w:szCs w:val="17"/>
+              </w:rPr>
+              <w:t>VARCHAR(</w:t>
+            </w:r>
+            <w:proofErr w:type="gramEnd"/>
+            <w:r>
+              <w:rPr>
+                <w:color w:val="000000"/>
+                <w:sz w:val="17"/>
+                <w:szCs w:val="17"/>
+              </w:rPr>
+              <w:t>20)</w:t>
             </w:r>
           </w:p>
         </w:tc>
@@ -22842,12 +23017,6 @@
         <w:gridCol w:w="3560"/>
       </w:tblGrid>
       <w:tr>
-        <w:tblPrEx>
-          <w:tblCellMar>
-            <w:top w:w="0" w:type="dxa"/>
-            <w:bottom w:w="0" w:type="dxa"/>
-          </w:tblCellMar>
-        </w:tblPrEx>
         <w:trPr>
           <w:tblHeader/>
         </w:trPr>
@@ -22979,12 +23148,6 @@
         </w:tc>
       </w:tr>
       <w:tr>
-        <w:tblPrEx>
-          <w:tblCellMar>
-            <w:top w:w="0" w:type="dxa"/>
-            <w:bottom w:w="0" w:type="dxa"/>
-          </w:tblCellMar>
-        </w:tblPrEx>
         <w:tc>
           <w:tcPr>
             <w:tcW w:w="2350" w:type="dxa"/>
@@ -23100,12 +23263,6 @@
         </w:tc>
       </w:tr>
       <w:tr>
-        <w:tblPrEx>
-          <w:tblCellMar>
-            <w:top w:w="0" w:type="dxa"/>
-            <w:bottom w:w="0" w:type="dxa"/>
-          </w:tblCellMar>
-        </w:tblPrEx>
         <w:tc>
           <w:tcPr>
             <w:tcW w:w="2350" w:type="dxa"/>
@@ -23142,13 +23299,23 @@
             </w:tcMar>
           </w:tcPr>
           <w:p>
-            <w:r>
-              <w:rPr>
-                <w:color w:val="000000"/>
-                <w:sz w:val="17"/>
-                <w:szCs w:val="17"/>
-              </w:rPr>
-              <w:t>VARCHAR(20)</w:t>
+            <w:proofErr w:type="gramStart"/>
+            <w:r>
+              <w:rPr>
+                <w:color w:val="000000"/>
+                <w:sz w:val="17"/>
+                <w:szCs w:val="17"/>
+              </w:rPr>
+              <w:t>VARCHAR(</w:t>
+            </w:r>
+            <w:proofErr w:type="gramEnd"/>
+            <w:r>
+              <w:rPr>
+                <w:color w:val="000000"/>
+                <w:sz w:val="17"/>
+                <w:szCs w:val="17"/>
+              </w:rPr>
+              <w:t>20)</w:t>
             </w:r>
           </w:p>
         </w:tc>
@@ -23226,12 +23393,6 @@
         </w:tc>
       </w:tr>
       <w:tr>
-        <w:tblPrEx>
-          <w:tblCellMar>
-            <w:top w:w="0" w:type="dxa"/>
-            <w:bottom w:w="0" w:type="dxa"/>
-          </w:tblCellMar>
-        </w:tblPrEx>
         <w:tc>
           <w:tcPr>
             <w:tcW w:w="2350" w:type="dxa"/>
@@ -23264,13 +23425,23 @@
             </w:tcMar>
           </w:tcPr>
           <w:p>
-            <w:r>
-              <w:rPr>
-                <w:color w:val="000000"/>
-                <w:sz w:val="17"/>
-                <w:szCs w:val="17"/>
-              </w:rPr>
-              <w:t>VARCHAR(150)</w:t>
+            <w:proofErr w:type="gramStart"/>
+            <w:r>
+              <w:rPr>
+                <w:color w:val="000000"/>
+                <w:sz w:val="17"/>
+                <w:szCs w:val="17"/>
+              </w:rPr>
+              <w:t>VARCHAR(</w:t>
+            </w:r>
+            <w:proofErr w:type="gramEnd"/>
+            <w:r>
+              <w:rPr>
+                <w:color w:val="000000"/>
+                <w:sz w:val="17"/>
+                <w:szCs w:val="17"/>
+              </w:rPr>
+              <w:t>150)</w:t>
             </w:r>
           </w:p>
         </w:tc>
@@ -23345,12 +23516,6 @@
         </w:tc>
       </w:tr>
       <w:tr>
-        <w:tblPrEx>
-          <w:tblCellMar>
-            <w:top w:w="0" w:type="dxa"/>
-            <w:bottom w:w="0" w:type="dxa"/>
-          </w:tblCellMar>
-        </w:tblPrEx>
         <w:tc>
           <w:tcPr>
             <w:tcW w:w="2350" w:type="dxa"/>
@@ -23387,13 +23552,23 @@
             </w:tcMar>
           </w:tcPr>
           <w:p>
-            <w:r>
-              <w:rPr>
-                <w:color w:val="000000"/>
-                <w:sz w:val="17"/>
-                <w:szCs w:val="17"/>
-              </w:rPr>
-              <w:t>VARCHAR(150)</w:t>
+            <w:proofErr w:type="gramStart"/>
+            <w:r>
+              <w:rPr>
+                <w:color w:val="000000"/>
+                <w:sz w:val="17"/>
+                <w:szCs w:val="17"/>
+              </w:rPr>
+              <w:t>VARCHAR(</w:t>
+            </w:r>
+            <w:proofErr w:type="gramEnd"/>
+            <w:r>
+              <w:rPr>
+                <w:color w:val="000000"/>
+                <w:sz w:val="17"/>
+                <w:szCs w:val="17"/>
+              </w:rPr>
+              <w:t>150)</w:t>
             </w:r>
           </w:p>
         </w:tc>
@@ -23471,12 +23646,6 @@
         </w:tc>
       </w:tr>
       <w:tr>
-        <w:tblPrEx>
-          <w:tblCellMar>
-            <w:top w:w="0" w:type="dxa"/>
-            <w:bottom w:w="0" w:type="dxa"/>
-          </w:tblCellMar>
-        </w:tblPrEx>
         <w:tc>
           <w:tcPr>
             <w:tcW w:w="2350" w:type="dxa"/>
@@ -23509,13 +23678,23 @@
             </w:tcMar>
           </w:tcPr>
           <w:p>
-            <w:r>
-              <w:rPr>
-                <w:color w:val="000000"/>
-                <w:sz w:val="17"/>
-                <w:szCs w:val="17"/>
-              </w:rPr>
-              <w:t>VARCHAR(80)</w:t>
+            <w:proofErr w:type="gramStart"/>
+            <w:r>
+              <w:rPr>
+                <w:color w:val="000000"/>
+                <w:sz w:val="17"/>
+                <w:szCs w:val="17"/>
+              </w:rPr>
+              <w:t>VARCHAR(</w:t>
+            </w:r>
+            <w:proofErr w:type="gramEnd"/>
+            <w:r>
+              <w:rPr>
+                <w:color w:val="000000"/>
+                <w:sz w:val="17"/>
+                <w:szCs w:val="17"/>
+              </w:rPr>
+              <w:t>80)</w:t>
             </w:r>
           </w:p>
         </w:tc>
@@ -23590,12 +23769,6 @@
         </w:tc>
       </w:tr>
       <w:tr>
-        <w:tblPrEx>
-          <w:tblCellMar>
-            <w:top w:w="0" w:type="dxa"/>
-            <w:bottom w:w="0" w:type="dxa"/>
-          </w:tblCellMar>
-        </w:tblPrEx>
         <w:tc>
           <w:tcPr>
             <w:tcW w:w="2350" w:type="dxa"/>
@@ -23630,13 +23803,23 @@
             </w:tcMar>
           </w:tcPr>
           <w:p>
-            <w:r>
-              <w:rPr>
-                <w:color w:val="000000"/>
-                <w:sz w:val="17"/>
-                <w:szCs w:val="17"/>
-              </w:rPr>
-              <w:t>VARCHAR(120)</w:t>
+            <w:proofErr w:type="gramStart"/>
+            <w:r>
+              <w:rPr>
+                <w:color w:val="000000"/>
+                <w:sz w:val="17"/>
+                <w:szCs w:val="17"/>
+              </w:rPr>
+              <w:t>VARCHAR(</w:t>
+            </w:r>
+            <w:proofErr w:type="gramEnd"/>
+            <w:r>
+              <w:rPr>
+                <w:color w:val="000000"/>
+                <w:sz w:val="17"/>
+                <w:szCs w:val="17"/>
+              </w:rPr>
+              <w:t>120)</w:t>
             </w:r>
           </w:p>
         </w:tc>
@@ -23714,12 +23897,6 @@
         </w:tc>
       </w:tr>
       <w:tr>
-        <w:tblPrEx>
-          <w:tblCellMar>
-            <w:top w:w="0" w:type="dxa"/>
-            <w:bottom w:w="0" w:type="dxa"/>
-          </w:tblCellMar>
-        </w:tblPrEx>
         <w:tc>
           <w:tcPr>
             <w:tcW w:w="2350" w:type="dxa"/>
@@ -23754,13 +23931,23 @@
             </w:tcMar>
           </w:tcPr>
           <w:p>
-            <w:r>
-              <w:rPr>
-                <w:color w:val="000000"/>
-                <w:sz w:val="17"/>
-                <w:szCs w:val="17"/>
-              </w:rPr>
-              <w:t>VARCHAR(20)</w:t>
+            <w:proofErr w:type="gramStart"/>
+            <w:r>
+              <w:rPr>
+                <w:color w:val="000000"/>
+                <w:sz w:val="17"/>
+                <w:szCs w:val="17"/>
+              </w:rPr>
+              <w:t>VARCHAR(</w:t>
+            </w:r>
+            <w:proofErr w:type="gramEnd"/>
+            <w:r>
+              <w:rPr>
+                <w:color w:val="000000"/>
+                <w:sz w:val="17"/>
+                <w:szCs w:val="17"/>
+              </w:rPr>
+              <w:t>20)</w:t>
             </w:r>
           </w:p>
         </w:tc>
@@ -23835,12 +24022,6 @@
         </w:tc>
       </w:tr>
       <w:tr>
-        <w:tblPrEx>
-          <w:tblCellMar>
-            <w:top w:w="0" w:type="dxa"/>
-            <w:bottom w:w="0" w:type="dxa"/>
-          </w:tblCellMar>
-        </w:tblPrEx>
         <w:tc>
           <w:tcPr>
             <w:tcW w:w="2350" w:type="dxa"/>
@@ -23875,13 +24056,23 @@
             </w:tcMar>
           </w:tcPr>
           <w:p>
-            <w:r>
-              <w:rPr>
-                <w:color w:val="000000"/>
-                <w:sz w:val="17"/>
-                <w:szCs w:val="17"/>
-              </w:rPr>
-              <w:t>VARCHAR(120)</w:t>
+            <w:proofErr w:type="gramStart"/>
+            <w:r>
+              <w:rPr>
+                <w:color w:val="000000"/>
+                <w:sz w:val="17"/>
+                <w:szCs w:val="17"/>
+              </w:rPr>
+              <w:t>VARCHAR(</w:t>
+            </w:r>
+            <w:proofErr w:type="gramEnd"/>
+            <w:r>
+              <w:rPr>
+                <w:color w:val="000000"/>
+                <w:sz w:val="17"/>
+                <w:szCs w:val="17"/>
+              </w:rPr>
+              <w:t>120)</w:t>
             </w:r>
           </w:p>
         </w:tc>
@@ -24013,12 +24204,6 @@
         <w:gridCol w:w="3560"/>
       </w:tblGrid>
       <w:tr>
-        <w:tblPrEx>
-          <w:tblCellMar>
-            <w:top w:w="0" w:type="dxa"/>
-            <w:bottom w:w="0" w:type="dxa"/>
-          </w:tblCellMar>
-        </w:tblPrEx>
         <w:trPr>
           <w:tblHeader/>
         </w:trPr>
@@ -24150,12 +24335,6 @@
         </w:tc>
       </w:tr>
       <w:tr>
-        <w:tblPrEx>
-          <w:tblCellMar>
-            <w:top w:w="0" w:type="dxa"/>
-            <w:bottom w:w="0" w:type="dxa"/>
-          </w:tblCellMar>
-        </w:tblPrEx>
         <w:tc>
           <w:tcPr>
             <w:tcW w:w="2350" w:type="dxa"/>
@@ -24271,12 +24450,6 @@
         </w:tc>
       </w:tr>
       <w:tr>
-        <w:tblPrEx>
-          <w:tblCellMar>
-            <w:top w:w="0" w:type="dxa"/>
-            <w:bottom w:w="0" w:type="dxa"/>
-          </w:tblCellMar>
-        </w:tblPrEx>
         <w:tc>
           <w:tcPr>
             <w:tcW w:w="2350" w:type="dxa"/>
@@ -24397,12 +24570,6 @@
         </w:tc>
       </w:tr>
       <w:tr>
-        <w:tblPrEx>
-          <w:tblCellMar>
-            <w:top w:w="0" w:type="dxa"/>
-            <w:bottom w:w="0" w:type="dxa"/>
-          </w:tblCellMar>
-        </w:tblPrEx>
         <w:tc>
           <w:tcPr>
             <w:tcW w:w="2350" w:type="dxa"/>
@@ -24435,13 +24602,23 @@
             </w:tcMar>
           </w:tcPr>
           <w:p>
-            <w:r>
-              <w:rPr>
-                <w:color w:val="000000"/>
-                <w:sz w:val="17"/>
-                <w:szCs w:val="17"/>
-              </w:rPr>
-              <w:t>VARCHAR(30)</w:t>
+            <w:proofErr w:type="gramStart"/>
+            <w:r>
+              <w:rPr>
+                <w:color w:val="000000"/>
+                <w:sz w:val="17"/>
+                <w:szCs w:val="17"/>
+              </w:rPr>
+              <w:t>VARCHAR(</w:t>
+            </w:r>
+            <w:proofErr w:type="gramEnd"/>
+            <w:r>
+              <w:rPr>
+                <w:color w:val="000000"/>
+                <w:sz w:val="17"/>
+                <w:szCs w:val="17"/>
+              </w:rPr>
+              <w:t>30)</w:t>
             </w:r>
           </w:p>
         </w:tc>
@@ -24516,12 +24693,6 @@
         </w:tc>
       </w:tr>
       <w:tr>
-        <w:tblPrEx>
-          <w:tblCellMar>
-            <w:top w:w="0" w:type="dxa"/>
-            <w:bottom w:w="0" w:type="dxa"/>
-          </w:tblCellMar>
-        </w:tblPrEx>
         <w:tc>
           <w:tcPr>
             <w:tcW w:w="2350" w:type="dxa"/>
@@ -24642,12 +24813,6 @@
         </w:tc>
       </w:tr>
       <w:tr>
-        <w:tblPrEx>
-          <w:tblCellMar>
-            <w:top w:w="0" w:type="dxa"/>
-            <w:bottom w:w="0" w:type="dxa"/>
-          </w:tblCellMar>
-        </w:tblPrEx>
         <w:tc>
           <w:tcPr>
             <w:tcW w:w="2350" w:type="dxa"/>
@@ -24781,12 +24946,6 @@
         </w:tc>
       </w:tr>
       <w:tr>
-        <w:tblPrEx>
-          <w:tblCellMar>
-            <w:top w:w="0" w:type="dxa"/>
-            <w:bottom w:w="0" w:type="dxa"/>
-          </w:tblCellMar>
-        </w:tblPrEx>
         <w:tc>
           <w:tcPr>
             <w:tcW w:w="2350" w:type="dxa"/>
@@ -24821,13 +24980,23 @@
             </w:tcMar>
           </w:tcPr>
           <w:p>
-            <w:r>
-              <w:rPr>
-                <w:color w:val="000000"/>
-                <w:sz w:val="17"/>
-                <w:szCs w:val="17"/>
-              </w:rPr>
-              <w:t>VARCHAR(20)</w:t>
+            <w:proofErr w:type="gramStart"/>
+            <w:r>
+              <w:rPr>
+                <w:color w:val="000000"/>
+                <w:sz w:val="17"/>
+                <w:szCs w:val="17"/>
+              </w:rPr>
+              <w:t>VARCHAR(</w:t>
+            </w:r>
+            <w:proofErr w:type="gramEnd"/>
+            <w:r>
+              <w:rPr>
+                <w:color w:val="000000"/>
+                <w:sz w:val="17"/>
+                <w:szCs w:val="17"/>
+              </w:rPr>
+              <w:t>20)</w:t>
             </w:r>
           </w:p>
         </w:tc>
@@ -24905,12 +25074,6 @@
         </w:tc>
       </w:tr>
       <w:tr>
-        <w:tblPrEx>
-          <w:tblCellMar>
-            <w:top w:w="0" w:type="dxa"/>
-            <w:bottom w:w="0" w:type="dxa"/>
-          </w:tblCellMar>
-        </w:tblPrEx>
         <w:tc>
           <w:tcPr>
             <w:tcW w:w="2350" w:type="dxa"/>
@@ -24945,13 +25108,23 @@
             </w:tcMar>
           </w:tcPr>
           <w:p>
-            <w:r>
-              <w:rPr>
-                <w:color w:val="000000"/>
-                <w:sz w:val="17"/>
-                <w:szCs w:val="17"/>
-              </w:rPr>
-              <w:t>VARCHAR(255)</w:t>
+            <w:proofErr w:type="gramStart"/>
+            <w:r>
+              <w:rPr>
+                <w:color w:val="000000"/>
+                <w:sz w:val="17"/>
+                <w:szCs w:val="17"/>
+              </w:rPr>
+              <w:t>VARCHAR(</w:t>
+            </w:r>
+            <w:proofErr w:type="gramEnd"/>
+            <w:r>
+              <w:rPr>
+                <w:color w:val="000000"/>
+                <w:sz w:val="17"/>
+                <w:szCs w:val="17"/>
+              </w:rPr>
+              <w:t>255)</w:t>
             </w:r>
           </w:p>
         </w:tc>
@@ -25080,12 +25253,6 @@
         <w:gridCol w:w="3560"/>
       </w:tblGrid>
       <w:tr>
-        <w:tblPrEx>
-          <w:tblCellMar>
-            <w:top w:w="0" w:type="dxa"/>
-            <w:bottom w:w="0" w:type="dxa"/>
-          </w:tblCellMar>
-        </w:tblPrEx>
         <w:trPr>
           <w:tblHeader/>
         </w:trPr>
@@ -25217,12 +25384,6 @@
         </w:tc>
       </w:tr>
       <w:tr>
-        <w:tblPrEx>
-          <w:tblCellMar>
-            <w:top w:w="0" w:type="dxa"/>
-            <w:bottom w:w="0" w:type="dxa"/>
-          </w:tblCellMar>
-        </w:tblPrEx>
         <w:tc>
           <w:tcPr>
             <w:tcW w:w="2350" w:type="dxa"/>
@@ -25338,12 +25499,6 @@
         </w:tc>
       </w:tr>
       <w:tr>
-        <w:tblPrEx>
-          <w:tblCellMar>
-            <w:top w:w="0" w:type="dxa"/>
-            <w:bottom w:w="0" w:type="dxa"/>
-          </w:tblCellMar>
-        </w:tblPrEx>
         <w:tc>
           <w:tcPr>
             <w:tcW w:w="2350" w:type="dxa"/>
@@ -25465,12 +25620,6 @@
         </w:tc>
       </w:tr>
       <w:tr>
-        <w:tblPrEx>
-          <w:tblCellMar>
-            <w:top w:w="0" w:type="dxa"/>
-            <w:bottom w:w="0" w:type="dxa"/>
-          </w:tblCellMar>
-        </w:tblPrEx>
         <w:tc>
           <w:tcPr>
             <w:tcW w:w="2350" w:type="dxa"/>
@@ -25505,13 +25654,23 @@
             </w:tcMar>
           </w:tcPr>
           <w:p>
-            <w:r>
-              <w:rPr>
-                <w:color w:val="000000"/>
-                <w:sz w:val="17"/>
-                <w:szCs w:val="17"/>
-              </w:rPr>
-              <w:t>VARCHAR(60)</w:t>
+            <w:proofErr w:type="gramStart"/>
+            <w:r>
+              <w:rPr>
+                <w:color w:val="000000"/>
+                <w:sz w:val="17"/>
+                <w:szCs w:val="17"/>
+              </w:rPr>
+              <w:t>VARCHAR(</w:t>
+            </w:r>
+            <w:proofErr w:type="gramEnd"/>
+            <w:r>
+              <w:rPr>
+                <w:color w:val="000000"/>
+                <w:sz w:val="17"/>
+                <w:szCs w:val="17"/>
+              </w:rPr>
+              <w:t>60)</w:t>
             </w:r>
           </w:p>
         </w:tc>
@@ -25586,12 +25745,6 @@
         </w:tc>
       </w:tr>
       <w:tr>
-        <w:tblPrEx>
-          <w:tblCellMar>
-            <w:top w:w="0" w:type="dxa"/>
-            <w:bottom w:w="0" w:type="dxa"/>
-          </w:tblCellMar>
-        </w:tblPrEx>
         <w:tc>
           <w:tcPr>
             <w:tcW w:w="2350" w:type="dxa"/>
@@ -25628,13 +25781,23 @@
             </w:tcMar>
           </w:tcPr>
           <w:p>
-            <w:r>
-              <w:rPr>
-                <w:color w:val="000000"/>
-                <w:sz w:val="17"/>
-                <w:szCs w:val="17"/>
-              </w:rPr>
-              <w:t>VARCHAR(60)</w:t>
+            <w:proofErr w:type="gramStart"/>
+            <w:r>
+              <w:rPr>
+                <w:color w:val="000000"/>
+                <w:sz w:val="17"/>
+                <w:szCs w:val="17"/>
+              </w:rPr>
+              <w:t>VARCHAR(</w:t>
+            </w:r>
+            <w:proofErr w:type="gramEnd"/>
+            <w:r>
+              <w:rPr>
+                <w:color w:val="000000"/>
+                <w:sz w:val="17"/>
+                <w:szCs w:val="17"/>
+              </w:rPr>
+              <w:t>60)</w:t>
             </w:r>
           </w:p>
         </w:tc>
@@ -25712,12 +25875,6 @@
         </w:tc>
       </w:tr>
       <w:tr>
-        <w:tblPrEx>
-          <w:tblCellMar>
-            <w:top w:w="0" w:type="dxa"/>
-            <w:bottom w:w="0" w:type="dxa"/>
-          </w:tblCellMar>
-        </w:tblPrEx>
         <w:tc>
           <w:tcPr>
             <w:tcW w:w="2350" w:type="dxa"/>
@@ -25750,13 +25907,23 @@
             </w:tcMar>
           </w:tcPr>
           <w:p>
-            <w:r>
-              <w:rPr>
-                <w:color w:val="000000"/>
-                <w:sz w:val="17"/>
-                <w:szCs w:val="17"/>
-              </w:rPr>
-              <w:t>VARCHAR(20)</w:t>
+            <w:proofErr w:type="gramStart"/>
+            <w:r>
+              <w:rPr>
+                <w:color w:val="000000"/>
+                <w:sz w:val="17"/>
+                <w:szCs w:val="17"/>
+              </w:rPr>
+              <w:t>VARCHAR(</w:t>
+            </w:r>
+            <w:proofErr w:type="gramEnd"/>
+            <w:r>
+              <w:rPr>
+                <w:color w:val="000000"/>
+                <w:sz w:val="17"/>
+                <w:szCs w:val="17"/>
+              </w:rPr>
+              <w:t>20)</w:t>
             </w:r>
           </w:p>
         </w:tc>
@@ -25831,12 +25998,6 @@
         </w:tc>
       </w:tr>
       <w:tr>
-        <w:tblPrEx>
-          <w:tblCellMar>
-            <w:top w:w="0" w:type="dxa"/>
-            <w:bottom w:w="0" w:type="dxa"/>
-          </w:tblCellMar>
-        </w:tblPrEx>
         <w:tc>
           <w:tcPr>
             <w:tcW w:w="2350" w:type="dxa"/>
@@ -25957,12 +26118,6 @@
         </w:tc>
       </w:tr>
       <w:tr>
-        <w:tblPrEx>
-          <w:tblCellMar>
-            <w:top w:w="0" w:type="dxa"/>
-            <w:bottom w:w="0" w:type="dxa"/>
-          </w:tblCellMar>
-        </w:tblPrEx>
         <w:tc>
           <w:tcPr>
             <w:tcW w:w="2350" w:type="dxa"/>
@@ -26096,12 +26251,6 @@
         </w:tc>
       </w:tr>
       <w:tr>
-        <w:tblPrEx>
-          <w:tblCellMar>
-            <w:top w:w="0" w:type="dxa"/>
-            <w:bottom w:w="0" w:type="dxa"/>
-          </w:tblCellMar>
-        </w:tblPrEx>
         <w:tc>
           <w:tcPr>
             <w:tcW w:w="2350" w:type="dxa"/>
@@ -26138,13 +26287,23 @@
             </w:tcMar>
           </w:tcPr>
           <w:p>
-            <w:r>
-              <w:rPr>
-                <w:color w:val="000000"/>
-                <w:sz w:val="17"/>
-                <w:szCs w:val="17"/>
-              </w:rPr>
-              <w:t>VARCHAR(120)</w:t>
+            <w:proofErr w:type="gramStart"/>
+            <w:r>
+              <w:rPr>
+                <w:color w:val="000000"/>
+                <w:sz w:val="17"/>
+                <w:szCs w:val="17"/>
+              </w:rPr>
+              <w:t>VARCHAR(</w:t>
+            </w:r>
+            <w:proofErr w:type="gramEnd"/>
+            <w:r>
+              <w:rPr>
+                <w:color w:val="000000"/>
+                <w:sz w:val="17"/>
+                <w:szCs w:val="17"/>
+              </w:rPr>
+              <w:t>120)</w:t>
             </w:r>
           </w:p>
         </w:tc>
@@ -26222,12 +26381,6 @@
         </w:tc>
       </w:tr>
       <w:tr>
-        <w:tblPrEx>
-          <w:tblCellMar>
-            <w:top w:w="0" w:type="dxa"/>
-            <w:bottom w:w="0" w:type="dxa"/>
-          </w:tblCellMar>
-        </w:tblPrEx>
         <w:tc>
           <w:tcPr>
             <w:tcW w:w="2350" w:type="dxa"/>
@@ -26260,13 +26413,23 @@
             </w:tcMar>
           </w:tcPr>
           <w:p>
-            <w:r>
-              <w:rPr>
-                <w:color w:val="000000"/>
-                <w:sz w:val="17"/>
-                <w:szCs w:val="17"/>
-              </w:rPr>
-              <w:t>VARCHAR(20)</w:t>
+            <w:proofErr w:type="gramStart"/>
+            <w:r>
+              <w:rPr>
+                <w:color w:val="000000"/>
+                <w:sz w:val="17"/>
+                <w:szCs w:val="17"/>
+              </w:rPr>
+              <w:t>VARCHAR(</w:t>
+            </w:r>
+            <w:proofErr w:type="gramEnd"/>
+            <w:r>
+              <w:rPr>
+                <w:color w:val="000000"/>
+                <w:sz w:val="17"/>
+                <w:szCs w:val="17"/>
+              </w:rPr>
+              <w:t>20)</w:t>
             </w:r>
           </w:p>
         </w:tc>
@@ -26395,12 +26558,6 @@
         <w:gridCol w:w="3560"/>
       </w:tblGrid>
       <w:tr>
-        <w:tblPrEx>
-          <w:tblCellMar>
-            <w:top w:w="0" w:type="dxa"/>
-            <w:bottom w:w="0" w:type="dxa"/>
-          </w:tblCellMar>
-        </w:tblPrEx>
         <w:trPr>
           <w:tblHeader/>
         </w:trPr>
@@ -26532,12 +26689,6 @@
         </w:tc>
       </w:tr>
       <w:tr>
-        <w:tblPrEx>
-          <w:tblCellMar>
-            <w:top w:w="0" w:type="dxa"/>
-            <w:bottom w:w="0" w:type="dxa"/>
-          </w:tblCellMar>
-        </w:tblPrEx>
         <w:tc>
           <w:tcPr>
             <w:tcW w:w="2350" w:type="dxa"/>
@@ -26653,12 +26804,6 @@
         </w:tc>
       </w:tr>
       <w:tr>
-        <w:tblPrEx>
-          <w:tblCellMar>
-            <w:top w:w="0" w:type="dxa"/>
-            <w:bottom w:w="0" w:type="dxa"/>
-          </w:tblCellMar>
-        </w:tblPrEx>
         <w:tc>
           <w:tcPr>
             <w:tcW w:w="2350" w:type="dxa"/>
@@ -26779,12 +26924,6 @@
         </w:tc>
       </w:tr>
       <w:tr>
-        <w:tblPrEx>
-          <w:tblCellMar>
-            <w:top w:w="0" w:type="dxa"/>
-            <w:bottom w:w="0" w:type="dxa"/>
-          </w:tblCellMar>
-        </w:tblPrEx>
         <w:tc>
           <w:tcPr>
             <w:tcW w:w="2350" w:type="dxa"/>
@@ -26817,13 +26956,23 @@
             </w:tcMar>
           </w:tcPr>
           <w:p>
-            <w:r>
-              <w:rPr>
-                <w:color w:val="000000"/>
-                <w:sz w:val="17"/>
-                <w:szCs w:val="17"/>
-              </w:rPr>
-              <w:t>VARCHAR(120)</w:t>
+            <w:proofErr w:type="gramStart"/>
+            <w:r>
+              <w:rPr>
+                <w:color w:val="000000"/>
+                <w:sz w:val="17"/>
+                <w:szCs w:val="17"/>
+              </w:rPr>
+              <w:t>VARCHAR(</w:t>
+            </w:r>
+            <w:proofErr w:type="gramEnd"/>
+            <w:r>
+              <w:rPr>
+                <w:color w:val="000000"/>
+                <w:sz w:val="17"/>
+                <w:szCs w:val="17"/>
+              </w:rPr>
+              <w:t>120)</w:t>
             </w:r>
           </w:p>
         </w:tc>
@@ -26898,12 +27047,6 @@
         </w:tc>
       </w:tr>
       <w:tr>
-        <w:tblPrEx>
-          <w:tblCellMar>
-            <w:top w:w="0" w:type="dxa"/>
-            <w:bottom w:w="0" w:type="dxa"/>
-          </w:tblCellMar>
-        </w:tblPrEx>
         <w:tc>
           <w:tcPr>
             <w:tcW w:w="2350" w:type="dxa"/>
@@ -26940,13 +27083,23 @@
             </w:tcMar>
           </w:tcPr>
           <w:p>
-            <w:r>
-              <w:rPr>
-                <w:color w:val="000000"/>
-                <w:sz w:val="17"/>
-                <w:szCs w:val="17"/>
-              </w:rPr>
-              <w:t>DECIMAL(5,2)</w:t>
+            <w:proofErr w:type="gramStart"/>
+            <w:r>
+              <w:rPr>
+                <w:color w:val="000000"/>
+                <w:sz w:val="17"/>
+                <w:szCs w:val="17"/>
+              </w:rPr>
+              <w:t>DECIMAL(</w:t>
+            </w:r>
+            <w:proofErr w:type="gramEnd"/>
+            <w:r>
+              <w:rPr>
+                <w:color w:val="000000"/>
+                <w:sz w:val="17"/>
+                <w:szCs w:val="17"/>
+              </w:rPr>
+              <w:t>5,2)</w:t>
             </w:r>
           </w:p>
         </w:tc>
@@ -27012,13 +27165,23 @@
             </w:tcMar>
           </w:tcPr>
           <w:p>
-            <w:r>
-              <w:rPr>
-                <w:color w:val="000000"/>
-                <w:sz w:val="17"/>
-                <w:szCs w:val="17"/>
-              </w:rPr>
-              <w:t>Total sobre el que se califica. Los pesos de los criterios deben sumar este valor.</w:t>
+            <w:proofErr w:type="gramStart"/>
+            <w:r>
+              <w:rPr>
+                <w:color w:val="000000"/>
+                <w:sz w:val="17"/>
+                <w:szCs w:val="17"/>
+              </w:rPr>
+              <w:t>Total</w:t>
+            </w:r>
+            <w:proofErr w:type="gramEnd"/>
+            <w:r>
+              <w:rPr>
+                <w:color w:val="000000"/>
+                <w:sz w:val="17"/>
+                <w:szCs w:val="17"/>
+              </w:rPr>
+              <w:t xml:space="preserve"> sobre el que se califica. Los pesos de los criterios deben sumar este valor.</w:t>
             </w:r>
           </w:p>
         </w:tc>
@@ -27078,12 +27241,6 @@
         <w:gridCol w:w="3560"/>
       </w:tblGrid>
       <w:tr>
-        <w:tblPrEx>
-          <w:tblCellMar>
-            <w:top w:w="0" w:type="dxa"/>
-            <w:bottom w:w="0" w:type="dxa"/>
-          </w:tblCellMar>
-        </w:tblPrEx>
         <w:trPr>
           <w:tblHeader/>
         </w:trPr>
@@ -27215,12 +27372,6 @@
         </w:tc>
       </w:tr>
       <w:tr>
-        <w:tblPrEx>
-          <w:tblCellMar>
-            <w:top w:w="0" w:type="dxa"/>
-            <w:bottom w:w="0" w:type="dxa"/>
-          </w:tblCellMar>
-        </w:tblPrEx>
         <w:tc>
           <w:tcPr>
             <w:tcW w:w="2350" w:type="dxa"/>
@@ -27336,12 +27487,6 @@
         </w:tc>
       </w:tr>
       <w:tr>
-        <w:tblPrEx>
-          <w:tblCellMar>
-            <w:top w:w="0" w:type="dxa"/>
-            <w:bottom w:w="0" w:type="dxa"/>
-          </w:tblCellMar>
-        </w:tblPrEx>
         <w:tc>
           <w:tcPr>
             <w:tcW w:w="2350" w:type="dxa"/>
@@ -27462,12 +27607,6 @@
         </w:tc>
       </w:tr>
       <w:tr>
-        <w:tblPrEx>
-          <w:tblCellMar>
-            <w:top w:w="0" w:type="dxa"/>
-            <w:bottom w:w="0" w:type="dxa"/>
-          </w:tblCellMar>
-        </w:tblPrEx>
         <w:tc>
           <w:tcPr>
             <w:tcW w:w="2350" w:type="dxa"/>
@@ -27500,13 +27639,23 @@
             </w:tcMar>
           </w:tcPr>
           <w:p>
-            <w:r>
-              <w:rPr>
-                <w:color w:val="000000"/>
-                <w:sz w:val="17"/>
-                <w:szCs w:val="17"/>
-              </w:rPr>
-              <w:t>VARCHAR(120)</w:t>
+            <w:proofErr w:type="gramStart"/>
+            <w:r>
+              <w:rPr>
+                <w:color w:val="000000"/>
+                <w:sz w:val="17"/>
+                <w:szCs w:val="17"/>
+              </w:rPr>
+              <w:t>VARCHAR(</w:t>
+            </w:r>
+            <w:proofErr w:type="gramEnd"/>
+            <w:r>
+              <w:rPr>
+                <w:color w:val="000000"/>
+                <w:sz w:val="17"/>
+                <w:szCs w:val="17"/>
+              </w:rPr>
+              <w:t>120)</w:t>
             </w:r>
           </w:p>
         </w:tc>
@@ -27581,12 +27730,6 @@
         </w:tc>
       </w:tr>
       <w:tr>
-        <w:tblPrEx>
-          <w:tblCellMar>
-            <w:top w:w="0" w:type="dxa"/>
-            <w:bottom w:w="0" w:type="dxa"/>
-          </w:tblCellMar>
-        </w:tblPrEx>
         <w:tc>
           <w:tcPr>
             <w:tcW w:w="2350" w:type="dxa"/>
@@ -27707,12 +27850,6 @@
         </w:tc>
       </w:tr>
       <w:tr>
-        <w:tblPrEx>
-          <w:tblCellMar>
-            <w:top w:w="0" w:type="dxa"/>
-            <w:bottom w:w="0" w:type="dxa"/>
-          </w:tblCellMar>
-        </w:tblPrEx>
         <w:tc>
           <w:tcPr>
             <w:tcW w:w="2350" w:type="dxa"/>
@@ -27745,13 +27882,23 @@
             </w:tcMar>
           </w:tcPr>
           <w:p>
-            <w:r>
-              <w:rPr>
-                <w:color w:val="000000"/>
-                <w:sz w:val="17"/>
-                <w:szCs w:val="17"/>
-              </w:rPr>
-              <w:t>DECIMAL(5,2)</w:t>
+            <w:proofErr w:type="gramStart"/>
+            <w:r>
+              <w:rPr>
+                <w:color w:val="000000"/>
+                <w:sz w:val="17"/>
+                <w:szCs w:val="17"/>
+              </w:rPr>
+              <w:t>DECIMAL(</w:t>
+            </w:r>
+            <w:proofErr w:type="gramEnd"/>
+            <w:r>
+              <w:rPr>
+                <w:color w:val="000000"/>
+                <w:sz w:val="17"/>
+                <w:szCs w:val="17"/>
+              </w:rPr>
+              <w:t>5,2)</w:t>
             </w:r>
           </w:p>
         </w:tc>
@@ -27852,7 +27999,27 @@
           <w:sz w:val="18"/>
           <w:szCs w:val="18"/>
         </w:rPr>
-        <w:t>Vinculación del practicante con una plaza, un docente asesor y un periodo. Proviene de la relación M:N cuaternaria del modelo conceptual, por lo que conserva los atributos propios de esa relación.</w:t>
+        <w:t xml:space="preserve">Vinculación del practicante con una plaza, un docente asesor y un periodo. Proviene de la relación </w:t>
+      </w:r>
+      <w:proofErr w:type="gramStart"/>
+      <w:r>
+        <w:rPr>
+          <w:i/>
+          <w:iCs/>
+          <w:sz w:val="18"/>
+          <w:szCs w:val="18"/>
+        </w:rPr>
+        <w:t>M:N</w:t>
+      </w:r>
+      <w:proofErr w:type="gramEnd"/>
+      <w:r>
+        <w:rPr>
+          <w:i/>
+          <w:iCs/>
+          <w:sz w:val="18"/>
+          <w:szCs w:val="18"/>
+        </w:rPr>
+        <w:t xml:space="preserve"> cuaternaria del modelo conceptual, por lo que conserva los atributos propios de esa relación.</w:t>
       </w:r>
     </w:p>
     <w:tbl>
@@ -27880,12 +28047,6 @@
         <w:gridCol w:w="3560"/>
       </w:tblGrid>
       <w:tr>
-        <w:tblPrEx>
-          <w:tblCellMar>
-            <w:top w:w="0" w:type="dxa"/>
-            <w:bottom w:w="0" w:type="dxa"/>
-          </w:tblCellMar>
-        </w:tblPrEx>
         <w:trPr>
           <w:tblHeader/>
         </w:trPr>
@@ -28017,12 +28178,6 @@
         </w:tc>
       </w:tr>
       <w:tr>
-        <w:tblPrEx>
-          <w:tblCellMar>
-            <w:top w:w="0" w:type="dxa"/>
-            <w:bottom w:w="0" w:type="dxa"/>
-          </w:tblCellMar>
-        </w:tblPrEx>
         <w:tc>
           <w:tcPr>
             <w:tcW w:w="2350" w:type="dxa"/>
@@ -28138,12 +28293,6 @@
         </w:tc>
       </w:tr>
       <w:tr>
-        <w:tblPrEx>
-          <w:tblCellMar>
-            <w:top w:w="0" w:type="dxa"/>
-            <w:bottom w:w="0" w:type="dxa"/>
-          </w:tblCellMar>
-        </w:tblPrEx>
         <w:tc>
           <w:tcPr>
             <w:tcW w:w="2350" w:type="dxa"/>
@@ -28264,12 +28413,6 @@
         </w:tc>
       </w:tr>
       <w:tr>
-        <w:tblPrEx>
-          <w:tblCellMar>
-            <w:top w:w="0" w:type="dxa"/>
-            <w:bottom w:w="0" w:type="dxa"/>
-          </w:tblCellMar>
-        </w:tblPrEx>
         <w:tc>
           <w:tcPr>
             <w:tcW w:w="2350" w:type="dxa"/>
@@ -28385,12 +28528,6 @@
         </w:tc>
       </w:tr>
       <w:tr>
-        <w:tblPrEx>
-          <w:tblCellMar>
-            <w:top w:w="0" w:type="dxa"/>
-            <w:bottom w:w="0" w:type="dxa"/>
-          </w:tblCellMar>
-        </w:tblPrEx>
         <w:tc>
           <w:tcPr>
             <w:tcW w:w="2350" w:type="dxa"/>
@@ -28512,12 +28649,6 @@
         </w:tc>
       </w:tr>
       <w:tr>
-        <w:tblPrEx>
-          <w:tblCellMar>
-            <w:top w:w="0" w:type="dxa"/>
-            <w:bottom w:w="0" w:type="dxa"/>
-          </w:tblCellMar>
-        </w:tblPrEx>
         <w:tc>
           <w:tcPr>
             <w:tcW w:w="2350" w:type="dxa"/>
@@ -28633,12 +28764,6 @@
         </w:tc>
       </w:tr>
       <w:tr>
-        <w:tblPrEx>
-          <w:tblCellMar>
-            <w:top w:w="0" w:type="dxa"/>
-            <w:bottom w:w="0" w:type="dxa"/>
-          </w:tblCellMar>
-        </w:tblPrEx>
         <w:tc>
           <w:tcPr>
             <w:tcW w:w="2350" w:type="dxa"/>
@@ -28759,12 +28884,6 @@
         </w:tc>
       </w:tr>
       <w:tr>
-        <w:tblPrEx>
-          <w:tblCellMar>
-            <w:top w:w="0" w:type="dxa"/>
-            <w:bottom w:w="0" w:type="dxa"/>
-          </w:tblCellMar>
-        </w:tblPrEx>
         <w:tc>
           <w:tcPr>
             <w:tcW w:w="2350" w:type="dxa"/>
@@ -28797,13 +28916,23 @@
             </w:tcMar>
           </w:tcPr>
           <w:p>
-            <w:r>
-              <w:rPr>
-                <w:color w:val="000000"/>
-                <w:sz w:val="17"/>
-                <w:szCs w:val="17"/>
-              </w:rPr>
-              <w:t>VARCHAR(20)</w:t>
+            <w:proofErr w:type="gramStart"/>
+            <w:r>
+              <w:rPr>
+                <w:color w:val="000000"/>
+                <w:sz w:val="17"/>
+                <w:szCs w:val="17"/>
+              </w:rPr>
+              <w:t>VARCHAR(</w:t>
+            </w:r>
+            <w:proofErr w:type="gramEnd"/>
+            <w:r>
+              <w:rPr>
+                <w:color w:val="000000"/>
+                <w:sz w:val="17"/>
+                <w:szCs w:val="17"/>
+              </w:rPr>
+              <w:t>20)</w:t>
             </w:r>
           </w:p>
         </w:tc>
@@ -28878,12 +29007,6 @@
         </w:tc>
       </w:tr>
       <w:tr>
-        <w:tblPrEx>
-          <w:tblCellMar>
-            <w:top w:w="0" w:type="dxa"/>
-            <w:bottom w:w="0" w:type="dxa"/>
-          </w:tblCellMar>
-        </w:tblPrEx>
         <w:tc>
           <w:tcPr>
             <w:tcW w:w="2350" w:type="dxa"/>
@@ -28920,13 +29043,23 @@
             </w:tcMar>
           </w:tcPr>
           <w:p>
-            <w:r>
-              <w:rPr>
-                <w:color w:val="000000"/>
-                <w:sz w:val="17"/>
-                <w:szCs w:val="17"/>
-              </w:rPr>
-              <w:t>VARCHAR(255)</w:t>
+            <w:proofErr w:type="gramStart"/>
+            <w:r>
+              <w:rPr>
+                <w:color w:val="000000"/>
+                <w:sz w:val="17"/>
+                <w:szCs w:val="17"/>
+              </w:rPr>
+              <w:t>VARCHAR(</w:t>
+            </w:r>
+            <w:proofErr w:type="gramEnd"/>
+            <w:r>
+              <w:rPr>
+                <w:color w:val="000000"/>
+                <w:sz w:val="17"/>
+                <w:szCs w:val="17"/>
+              </w:rPr>
+              <w:t>255)</w:t>
             </w:r>
           </w:p>
         </w:tc>
@@ -29004,12 +29137,6 @@
         </w:tc>
       </w:tr>
       <w:tr>
-        <w:tblPrEx>
-          <w:tblCellMar>
-            <w:top w:w="0" w:type="dxa"/>
-            <w:bottom w:w="0" w:type="dxa"/>
-          </w:tblCellMar>
-        </w:tblPrEx>
         <w:tc>
           <w:tcPr>
             <w:tcW w:w="2350" w:type="dxa"/>
@@ -29044,13 +29171,23 @@
             </w:tcMar>
           </w:tcPr>
           <w:p>
-            <w:r>
-              <w:rPr>
-                <w:color w:val="000000"/>
-                <w:sz w:val="17"/>
-                <w:szCs w:val="17"/>
-              </w:rPr>
-              <w:t>DECIMAL(6,2)</w:t>
+            <w:proofErr w:type="gramStart"/>
+            <w:r>
+              <w:rPr>
+                <w:color w:val="000000"/>
+                <w:sz w:val="17"/>
+                <w:szCs w:val="17"/>
+              </w:rPr>
+              <w:t>DECIMAL(</w:t>
+            </w:r>
+            <w:proofErr w:type="gramEnd"/>
+            <w:r>
+              <w:rPr>
+                <w:color w:val="000000"/>
+                <w:sz w:val="17"/>
+                <w:szCs w:val="17"/>
+              </w:rPr>
+              <w:t>6,2)</w:t>
             </w:r>
           </w:p>
         </w:tc>
@@ -29125,12 +29262,6 @@
         </w:tc>
       </w:tr>
       <w:tr>
-        <w:tblPrEx>
-          <w:tblCellMar>
-            <w:top w:w="0" w:type="dxa"/>
-            <w:bottom w:w="0" w:type="dxa"/>
-          </w:tblCellMar>
-        </w:tblPrEx>
         <w:tc>
           <w:tcPr>
             <w:tcW w:w="2350" w:type="dxa"/>
@@ -29251,12 +29382,6 @@
         </w:tc>
       </w:tr>
       <w:tr>
-        <w:tblPrEx>
-          <w:tblCellMar>
-            <w:top w:w="0" w:type="dxa"/>
-            <w:bottom w:w="0" w:type="dxa"/>
-          </w:tblCellMar>
-        </w:tblPrEx>
         <w:tc>
           <w:tcPr>
             <w:tcW w:w="2350" w:type="dxa"/>
@@ -29426,12 +29551,6 @@
         <w:gridCol w:w="3560"/>
       </w:tblGrid>
       <w:tr>
-        <w:tblPrEx>
-          <w:tblCellMar>
-            <w:top w:w="0" w:type="dxa"/>
-            <w:bottom w:w="0" w:type="dxa"/>
-          </w:tblCellMar>
-        </w:tblPrEx>
         <w:trPr>
           <w:tblHeader/>
         </w:trPr>
@@ -29563,12 +29682,6 @@
         </w:tc>
       </w:tr>
       <w:tr>
-        <w:tblPrEx>
-          <w:tblCellMar>
-            <w:top w:w="0" w:type="dxa"/>
-            <w:bottom w:w="0" w:type="dxa"/>
-          </w:tblCellMar>
-        </w:tblPrEx>
         <w:tc>
           <w:tcPr>
             <w:tcW w:w="2350" w:type="dxa"/>
@@ -29684,12 +29797,6 @@
         </w:tc>
       </w:tr>
       <w:tr>
-        <w:tblPrEx>
-          <w:tblCellMar>
-            <w:top w:w="0" w:type="dxa"/>
-            <w:bottom w:w="0" w:type="dxa"/>
-          </w:tblCellMar>
-        </w:tblPrEx>
         <w:tc>
           <w:tcPr>
             <w:tcW w:w="2350" w:type="dxa"/>
@@ -29810,12 +29917,6 @@
         </w:tc>
       </w:tr>
       <w:tr>
-        <w:tblPrEx>
-          <w:tblCellMar>
-            <w:top w:w="0" w:type="dxa"/>
-            <w:bottom w:w="0" w:type="dxa"/>
-          </w:tblCellMar>
-        </w:tblPrEx>
         <w:tc>
           <w:tcPr>
             <w:tcW w:w="2350" w:type="dxa"/>
@@ -29931,12 +30032,6 @@
         </w:tc>
       </w:tr>
       <w:tr>
-        <w:tblPrEx>
-          <w:tblCellMar>
-            <w:top w:w="0" w:type="dxa"/>
-            <w:bottom w:w="0" w:type="dxa"/>
-          </w:tblCellMar>
-        </w:tblPrEx>
         <w:tc>
           <w:tcPr>
             <w:tcW w:w="2350" w:type="dxa"/>
@@ -30057,12 +30152,6 @@
         </w:tc>
       </w:tr>
       <w:tr>
-        <w:tblPrEx>
-          <w:tblCellMar>
-            <w:top w:w="0" w:type="dxa"/>
-            <w:bottom w:w="0" w:type="dxa"/>
-          </w:tblCellMar>
-        </w:tblPrEx>
         <w:tc>
           <w:tcPr>
             <w:tcW w:w="2350" w:type="dxa"/>
@@ -30097,13 +30186,23 @@
             </w:tcMar>
           </w:tcPr>
           <w:p>
-            <w:r>
-              <w:rPr>
-                <w:color w:val="000000"/>
-                <w:sz w:val="17"/>
-                <w:szCs w:val="17"/>
-              </w:rPr>
-              <w:t>VARCHAR(40)</w:t>
+            <w:proofErr w:type="gramStart"/>
+            <w:r>
+              <w:rPr>
+                <w:color w:val="000000"/>
+                <w:sz w:val="17"/>
+                <w:szCs w:val="17"/>
+              </w:rPr>
+              <w:t>VARCHAR(</w:t>
+            </w:r>
+            <w:proofErr w:type="gramEnd"/>
+            <w:r>
+              <w:rPr>
+                <w:color w:val="000000"/>
+                <w:sz w:val="17"/>
+                <w:szCs w:val="17"/>
+              </w:rPr>
+              <w:t>40)</w:t>
             </w:r>
           </w:p>
         </w:tc>
@@ -30178,12 +30277,6 @@
         </w:tc>
       </w:tr>
       <w:tr>
-        <w:tblPrEx>
-          <w:tblCellMar>
-            <w:top w:w="0" w:type="dxa"/>
-            <w:bottom w:w="0" w:type="dxa"/>
-          </w:tblCellMar>
-        </w:tblPrEx>
         <w:tc>
           <w:tcPr>
             <w:tcW w:w="2350" w:type="dxa"/>
@@ -30218,13 +30311,23 @@
             </w:tcMar>
           </w:tcPr>
           <w:p>
-            <w:r>
-              <w:rPr>
-                <w:color w:val="000000"/>
-                <w:sz w:val="17"/>
-                <w:szCs w:val="17"/>
-              </w:rPr>
-              <w:t>VARCHAR(150)</w:t>
+            <w:proofErr w:type="gramStart"/>
+            <w:r>
+              <w:rPr>
+                <w:color w:val="000000"/>
+                <w:sz w:val="17"/>
+                <w:szCs w:val="17"/>
+              </w:rPr>
+              <w:t>VARCHAR(</w:t>
+            </w:r>
+            <w:proofErr w:type="gramEnd"/>
+            <w:r>
+              <w:rPr>
+                <w:color w:val="000000"/>
+                <w:sz w:val="17"/>
+                <w:szCs w:val="17"/>
+              </w:rPr>
+              <w:t>150)</w:t>
             </w:r>
           </w:p>
         </w:tc>
@@ -30302,12 +30405,6 @@
         </w:tc>
       </w:tr>
       <w:tr>
-        <w:tblPrEx>
-          <w:tblCellMar>
-            <w:top w:w="0" w:type="dxa"/>
-            <w:bottom w:w="0" w:type="dxa"/>
-          </w:tblCellMar>
-        </w:tblPrEx>
         <w:tc>
           <w:tcPr>
             <w:tcW w:w="2350" w:type="dxa"/>
@@ -30340,13 +30437,23 @@
             </w:tcMar>
           </w:tcPr>
           <w:p>
-            <w:r>
-              <w:rPr>
-                <w:color w:val="000000"/>
-                <w:sz w:val="17"/>
-                <w:szCs w:val="17"/>
-              </w:rPr>
-              <w:t>DECIMAL(4,2)</w:t>
+            <w:proofErr w:type="gramStart"/>
+            <w:r>
+              <w:rPr>
+                <w:color w:val="000000"/>
+                <w:sz w:val="17"/>
+                <w:szCs w:val="17"/>
+              </w:rPr>
+              <w:t>DECIMAL(</w:t>
+            </w:r>
+            <w:proofErr w:type="gramEnd"/>
+            <w:r>
+              <w:rPr>
+                <w:color w:val="000000"/>
+                <w:sz w:val="17"/>
+                <w:szCs w:val="17"/>
+              </w:rPr>
+              <w:t>4,2)</w:t>
             </w:r>
           </w:p>
         </w:tc>
@@ -30439,12 +30546,6 @@
         </w:tc>
       </w:tr>
       <w:tr>
-        <w:tblPrEx>
-          <w:tblCellMar>
-            <w:top w:w="0" w:type="dxa"/>
-            <w:bottom w:w="0" w:type="dxa"/>
-          </w:tblCellMar>
-        </w:tblPrEx>
         <w:tc>
           <w:tcPr>
             <w:tcW w:w="2350" w:type="dxa"/>
@@ -30565,12 +30666,6 @@
         </w:tc>
       </w:tr>
       <w:tr>
-        <w:tblPrEx>
-          <w:tblCellMar>
-            <w:top w:w="0" w:type="dxa"/>
-            <w:bottom w:w="0" w:type="dxa"/>
-          </w:tblCellMar>
-        </w:tblPrEx>
         <w:tc>
           <w:tcPr>
             <w:tcW w:w="2350" w:type="dxa"/>
@@ -30686,12 +30781,6 @@
         </w:tc>
       </w:tr>
       <w:tr>
-        <w:tblPrEx>
-          <w:tblCellMar>
-            <w:top w:w="0" w:type="dxa"/>
-            <w:bottom w:w="0" w:type="dxa"/>
-          </w:tblCellMar>
-        </w:tblPrEx>
         <w:tc>
           <w:tcPr>
             <w:tcW w:w="2350" w:type="dxa"/>
@@ -30726,13 +30815,23 @@
             </w:tcMar>
           </w:tcPr>
           <w:p>
-            <w:r>
-              <w:rPr>
-                <w:color w:val="000000"/>
-                <w:sz w:val="17"/>
-                <w:szCs w:val="17"/>
-              </w:rPr>
-              <w:t>VARCHAR(20)</w:t>
+            <w:proofErr w:type="gramStart"/>
+            <w:r>
+              <w:rPr>
+                <w:color w:val="000000"/>
+                <w:sz w:val="17"/>
+                <w:szCs w:val="17"/>
+              </w:rPr>
+              <w:t>VARCHAR(</w:t>
+            </w:r>
+            <w:proofErr w:type="gramEnd"/>
+            <w:r>
+              <w:rPr>
+                <w:color w:val="000000"/>
+                <w:sz w:val="17"/>
+                <w:szCs w:val="17"/>
+              </w:rPr>
+              <w:t>20)</w:t>
             </w:r>
           </w:p>
         </w:tc>
@@ -30810,12 +30909,6 @@
         </w:tc>
       </w:tr>
       <w:tr>
-        <w:tblPrEx>
-          <w:tblCellMar>
-            <w:top w:w="0" w:type="dxa"/>
-            <w:bottom w:w="0" w:type="dxa"/>
-          </w:tblCellMar>
-        </w:tblPrEx>
         <w:tc>
           <w:tcPr>
             <w:tcW w:w="2350" w:type="dxa"/>
@@ -30949,12 +31042,6 @@
         </w:tc>
       </w:tr>
       <w:tr>
-        <w:tblPrEx>
-          <w:tblCellMar>
-            <w:top w:w="0" w:type="dxa"/>
-            <w:bottom w:w="0" w:type="dxa"/>
-          </w:tblCellMar>
-        </w:tblPrEx>
         <w:tc>
           <w:tcPr>
             <w:tcW w:w="2350" w:type="dxa"/>
@@ -31075,12 +31162,6 @@
         </w:tc>
       </w:tr>
       <w:tr>
-        <w:tblPrEx>
-          <w:tblCellMar>
-            <w:top w:w="0" w:type="dxa"/>
-            <w:bottom w:w="0" w:type="dxa"/>
-          </w:tblCellMar>
-        </w:tblPrEx>
         <w:tc>
           <w:tcPr>
             <w:tcW w:w="2350" w:type="dxa"/>
@@ -31250,12 +31331,6 @@
         <w:gridCol w:w="3560"/>
       </w:tblGrid>
       <w:tr>
-        <w:tblPrEx>
-          <w:tblCellMar>
-            <w:top w:w="0" w:type="dxa"/>
-            <w:bottom w:w="0" w:type="dxa"/>
-          </w:tblCellMar>
-        </w:tblPrEx>
         <w:trPr>
           <w:tblHeader/>
         </w:trPr>
@@ -31388,12 +31463,6 @@
         </w:tc>
       </w:tr>
       <w:tr>
-        <w:tblPrEx>
-          <w:tblCellMar>
-            <w:top w:w="0" w:type="dxa"/>
-            <w:bottom w:w="0" w:type="dxa"/>
-          </w:tblCellMar>
-        </w:tblPrEx>
         <w:tc>
           <w:tcPr>
             <w:tcW w:w="2350" w:type="dxa"/>
@@ -31509,12 +31578,6 @@
         </w:tc>
       </w:tr>
       <w:tr>
-        <w:tblPrEx>
-          <w:tblCellMar>
-            <w:top w:w="0" w:type="dxa"/>
-            <w:bottom w:w="0" w:type="dxa"/>
-          </w:tblCellMar>
-        </w:tblPrEx>
         <w:tc>
           <w:tcPr>
             <w:tcW w:w="2350" w:type="dxa"/>
@@ -31635,12 +31698,6 @@
         </w:tc>
       </w:tr>
       <w:tr>
-        <w:tblPrEx>
-          <w:tblCellMar>
-            <w:top w:w="0" w:type="dxa"/>
-            <w:bottom w:w="0" w:type="dxa"/>
-          </w:tblCellMar>
-        </w:tblPrEx>
         <w:tc>
           <w:tcPr>
             <w:tcW w:w="2350" w:type="dxa"/>
@@ -31675,13 +31732,23 @@
             </w:tcMar>
           </w:tcPr>
           <w:p>
-            <w:r>
-              <w:rPr>
-                <w:color w:val="000000"/>
-                <w:sz w:val="17"/>
-                <w:szCs w:val="17"/>
-              </w:rPr>
-              <w:t>VARCHAR(40)</w:t>
+            <w:proofErr w:type="gramStart"/>
+            <w:r>
+              <w:rPr>
+                <w:color w:val="000000"/>
+                <w:sz w:val="17"/>
+                <w:szCs w:val="17"/>
+              </w:rPr>
+              <w:t>VARCHAR(</w:t>
+            </w:r>
+            <w:proofErr w:type="gramEnd"/>
+            <w:r>
+              <w:rPr>
+                <w:color w:val="000000"/>
+                <w:sz w:val="17"/>
+                <w:szCs w:val="17"/>
+              </w:rPr>
+              <w:t>40)</w:t>
             </w:r>
           </w:p>
         </w:tc>
@@ -31802,12 +31869,6 @@
         </w:tc>
       </w:tr>
       <w:tr>
-        <w:tblPrEx>
-          <w:tblCellMar>
-            <w:top w:w="0" w:type="dxa"/>
-            <w:bottom w:w="0" w:type="dxa"/>
-          </w:tblCellMar>
-        </w:tblPrEx>
         <w:tc>
           <w:tcPr>
             <w:tcW w:w="2350" w:type="dxa"/>
@@ -31844,13 +31905,23 @@
             </w:tcMar>
           </w:tcPr>
           <w:p>
-            <w:r>
-              <w:rPr>
-                <w:color w:val="000000"/>
-                <w:sz w:val="17"/>
-                <w:szCs w:val="17"/>
-              </w:rPr>
-              <w:t>VARCHAR(150)</w:t>
+            <w:proofErr w:type="gramStart"/>
+            <w:r>
+              <w:rPr>
+                <w:color w:val="000000"/>
+                <w:sz w:val="17"/>
+                <w:szCs w:val="17"/>
+              </w:rPr>
+              <w:t>VARCHAR(</w:t>
+            </w:r>
+            <w:proofErr w:type="gramEnd"/>
+            <w:r>
+              <w:rPr>
+                <w:color w:val="000000"/>
+                <w:sz w:val="17"/>
+                <w:szCs w:val="17"/>
+              </w:rPr>
+              <w:t>150)</w:t>
             </w:r>
           </w:p>
         </w:tc>
@@ -31928,12 +31999,6 @@
         </w:tc>
       </w:tr>
       <w:tr>
-        <w:tblPrEx>
-          <w:tblCellMar>
-            <w:top w:w="0" w:type="dxa"/>
-            <w:bottom w:w="0" w:type="dxa"/>
-          </w:tblCellMar>
-        </w:tblPrEx>
         <w:tc>
           <w:tcPr>
             <w:tcW w:w="2350" w:type="dxa"/>
@@ -31966,13 +32031,23 @@
             </w:tcMar>
           </w:tcPr>
           <w:p>
-            <w:r>
-              <w:rPr>
-                <w:color w:val="000000"/>
-                <w:sz w:val="17"/>
-                <w:szCs w:val="17"/>
-              </w:rPr>
-              <w:t>VARCHAR(10)</w:t>
+            <w:proofErr w:type="gramStart"/>
+            <w:r>
+              <w:rPr>
+                <w:color w:val="000000"/>
+                <w:sz w:val="17"/>
+                <w:szCs w:val="17"/>
+              </w:rPr>
+              <w:t>VARCHAR(</w:t>
+            </w:r>
+            <w:proofErr w:type="gramEnd"/>
+            <w:r>
+              <w:rPr>
+                <w:color w:val="000000"/>
+                <w:sz w:val="17"/>
+                <w:szCs w:val="17"/>
+              </w:rPr>
+              <w:t>10)</w:t>
             </w:r>
           </w:p>
         </w:tc>
@@ -32047,12 +32122,6 @@
         </w:tc>
       </w:tr>
       <w:tr>
-        <w:tblPrEx>
-          <w:tblCellMar>
-            <w:top w:w="0" w:type="dxa"/>
-            <w:bottom w:w="0" w:type="dxa"/>
-          </w:tblCellMar>
-        </w:tblPrEx>
         <w:tc>
           <w:tcPr>
             <w:tcW w:w="2350" w:type="dxa"/>
@@ -32173,12 +32242,6 @@
         </w:tc>
       </w:tr>
       <w:tr>
-        <w:tblPrEx>
-          <w:tblCellMar>
-            <w:top w:w="0" w:type="dxa"/>
-            <w:bottom w:w="0" w:type="dxa"/>
-          </w:tblCellMar>
-        </w:tblPrEx>
         <w:tc>
           <w:tcPr>
             <w:tcW w:w="2350" w:type="dxa"/>
@@ -32213,13 +32276,23 @@
             </w:tcMar>
           </w:tcPr>
           <w:p>
-            <w:r>
-              <w:rPr>
-                <w:color w:val="000000"/>
-                <w:sz w:val="17"/>
-                <w:szCs w:val="17"/>
-              </w:rPr>
-              <w:t>VARCHAR(100)</w:t>
+            <w:proofErr w:type="gramStart"/>
+            <w:r>
+              <w:rPr>
+                <w:color w:val="000000"/>
+                <w:sz w:val="17"/>
+                <w:szCs w:val="17"/>
+              </w:rPr>
+              <w:t>VARCHAR(</w:t>
+            </w:r>
+            <w:proofErr w:type="gramEnd"/>
+            <w:r>
+              <w:rPr>
+                <w:color w:val="000000"/>
+                <w:sz w:val="17"/>
+                <w:szCs w:val="17"/>
+              </w:rPr>
+              <w:t>100)</w:t>
             </w:r>
           </w:p>
         </w:tc>
@@ -32348,12 +32421,6 @@
         <w:gridCol w:w="3560"/>
       </w:tblGrid>
       <w:tr>
-        <w:tblPrEx>
-          <w:tblCellMar>
-            <w:top w:w="0" w:type="dxa"/>
-            <w:bottom w:w="0" w:type="dxa"/>
-          </w:tblCellMar>
-        </w:tblPrEx>
         <w:trPr>
           <w:tblHeader/>
         </w:trPr>
@@ -32485,12 +32552,6 @@
         </w:tc>
       </w:tr>
       <w:tr>
-        <w:tblPrEx>
-          <w:tblCellMar>
-            <w:top w:w="0" w:type="dxa"/>
-            <w:bottom w:w="0" w:type="dxa"/>
-          </w:tblCellMar>
-        </w:tblPrEx>
         <w:tc>
           <w:tcPr>
             <w:tcW w:w="2350" w:type="dxa"/>
@@ -32606,12 +32667,6 @@
         </w:tc>
       </w:tr>
       <w:tr>
-        <w:tblPrEx>
-          <w:tblCellMar>
-            <w:top w:w="0" w:type="dxa"/>
-            <w:bottom w:w="0" w:type="dxa"/>
-          </w:tblCellMar>
-        </w:tblPrEx>
         <w:tc>
           <w:tcPr>
             <w:tcW w:w="2350" w:type="dxa"/>
@@ -32732,12 +32787,6 @@
         </w:tc>
       </w:tr>
       <w:tr>
-        <w:tblPrEx>
-          <w:tblCellMar>
-            <w:top w:w="0" w:type="dxa"/>
-            <w:bottom w:w="0" w:type="dxa"/>
-          </w:tblCellMar>
-        </w:tblPrEx>
         <w:tc>
           <w:tcPr>
             <w:tcW w:w="2350" w:type="dxa"/>
@@ -32853,12 +32902,6 @@
         </w:tc>
       </w:tr>
       <w:tr>
-        <w:tblPrEx>
-          <w:tblCellMar>
-            <w:top w:w="0" w:type="dxa"/>
-            <w:bottom w:w="0" w:type="dxa"/>
-          </w:tblCellMar>
-        </w:tblPrEx>
         <w:tc>
           <w:tcPr>
             <w:tcW w:w="2350" w:type="dxa"/>
@@ -32979,12 +33022,6 @@
         </w:tc>
       </w:tr>
       <w:tr>
-        <w:tblPrEx>
-          <w:tblCellMar>
-            <w:top w:w="0" w:type="dxa"/>
-            <w:bottom w:w="0" w:type="dxa"/>
-          </w:tblCellMar>
-        </w:tblPrEx>
         <w:tc>
           <w:tcPr>
             <w:tcW w:w="2350" w:type="dxa"/>
@@ -33017,13 +33054,23 @@
             </w:tcMar>
           </w:tcPr>
           <w:p>
-            <w:r>
-              <w:rPr>
-                <w:color w:val="000000"/>
-                <w:sz w:val="17"/>
-                <w:szCs w:val="17"/>
-              </w:rPr>
-              <w:t>VARCHAR(20)</w:t>
+            <w:proofErr w:type="gramStart"/>
+            <w:r>
+              <w:rPr>
+                <w:color w:val="000000"/>
+                <w:sz w:val="17"/>
+                <w:szCs w:val="17"/>
+              </w:rPr>
+              <w:t>VARCHAR(</w:t>
+            </w:r>
+            <w:proofErr w:type="gramEnd"/>
+            <w:r>
+              <w:rPr>
+                <w:color w:val="000000"/>
+                <w:sz w:val="17"/>
+                <w:szCs w:val="17"/>
+              </w:rPr>
+              <w:t>20)</w:t>
             </w:r>
           </w:p>
         </w:tc>
@@ -33098,12 +33145,6 @@
         </w:tc>
       </w:tr>
       <w:tr>
-        <w:tblPrEx>
-          <w:tblCellMar>
-            <w:top w:w="0" w:type="dxa"/>
-            <w:bottom w:w="0" w:type="dxa"/>
-          </w:tblCellMar>
-        </w:tblPrEx>
         <w:tc>
           <w:tcPr>
             <w:tcW w:w="2350" w:type="dxa"/>
@@ -33222,12 +33263,6 @@
         </w:tc>
       </w:tr>
       <w:tr>
-        <w:tblPrEx>
-          <w:tblCellMar>
-            <w:top w:w="0" w:type="dxa"/>
-            <w:bottom w:w="0" w:type="dxa"/>
-          </w:tblCellMar>
-        </w:tblPrEx>
         <w:tc>
           <w:tcPr>
             <w:tcW w:w="2350" w:type="dxa"/>
@@ -33262,13 +33297,23 @@
             </w:tcMar>
           </w:tcPr>
           <w:p>
-            <w:r>
-              <w:rPr>
-                <w:color w:val="000000"/>
-                <w:sz w:val="17"/>
-                <w:szCs w:val="17"/>
-              </w:rPr>
-              <w:t>VARCHAR(100)</w:t>
+            <w:proofErr w:type="gramStart"/>
+            <w:r>
+              <w:rPr>
+                <w:color w:val="000000"/>
+                <w:sz w:val="17"/>
+                <w:szCs w:val="17"/>
+              </w:rPr>
+              <w:t>VARCHAR(</w:t>
+            </w:r>
+            <w:proofErr w:type="gramEnd"/>
+            <w:r>
+              <w:rPr>
+                <w:color w:val="000000"/>
+                <w:sz w:val="17"/>
+                <w:szCs w:val="17"/>
+              </w:rPr>
+              <w:t>100)</w:t>
             </w:r>
           </w:p>
         </w:tc>
@@ -33397,12 +33442,6 @@
         <w:gridCol w:w="3560"/>
       </w:tblGrid>
       <w:tr>
-        <w:tblPrEx>
-          <w:tblCellMar>
-            <w:top w:w="0" w:type="dxa"/>
-            <w:bottom w:w="0" w:type="dxa"/>
-          </w:tblCellMar>
-        </w:tblPrEx>
         <w:trPr>
           <w:tblHeader/>
         </w:trPr>
@@ -33534,12 +33573,6 @@
         </w:tc>
       </w:tr>
       <w:tr>
-        <w:tblPrEx>
-          <w:tblCellMar>
-            <w:top w:w="0" w:type="dxa"/>
-            <w:bottom w:w="0" w:type="dxa"/>
-          </w:tblCellMar>
-        </w:tblPrEx>
         <w:tc>
           <w:tcPr>
             <w:tcW w:w="2350" w:type="dxa"/>
@@ -33655,12 +33688,6 @@
         </w:tc>
       </w:tr>
       <w:tr>
-        <w:tblPrEx>
-          <w:tblCellMar>
-            <w:top w:w="0" w:type="dxa"/>
-            <w:bottom w:w="0" w:type="dxa"/>
-          </w:tblCellMar>
-        </w:tblPrEx>
         <w:tc>
           <w:tcPr>
             <w:tcW w:w="2350" w:type="dxa"/>
@@ -33781,12 +33808,6 @@
         </w:tc>
       </w:tr>
       <w:tr>
-        <w:tblPrEx>
-          <w:tblCellMar>
-            <w:top w:w="0" w:type="dxa"/>
-            <w:bottom w:w="0" w:type="dxa"/>
-          </w:tblCellMar>
-        </w:tblPrEx>
         <w:tc>
           <w:tcPr>
             <w:tcW w:w="2350" w:type="dxa"/>
@@ -33902,12 +33923,6 @@
         </w:tc>
       </w:tr>
       <w:tr>
-        <w:tblPrEx>
-          <w:tblCellMar>
-            <w:top w:w="0" w:type="dxa"/>
-            <w:bottom w:w="0" w:type="dxa"/>
-          </w:tblCellMar>
-        </w:tblPrEx>
         <w:tc>
           <w:tcPr>
             <w:tcW w:w="2350" w:type="dxa"/>
@@ -34026,12 +34041,6 @@
         </w:tc>
       </w:tr>
       <w:tr>
-        <w:tblPrEx>
-          <w:tblCellMar>
-            <w:top w:w="0" w:type="dxa"/>
-            <w:bottom w:w="0" w:type="dxa"/>
-          </w:tblCellMar>
-        </w:tblPrEx>
         <w:tc>
           <w:tcPr>
             <w:tcW w:w="2350" w:type="dxa"/>
@@ -34066,13 +34075,23 @@
             </w:tcMar>
           </w:tcPr>
           <w:p>
-            <w:r>
-              <w:rPr>
-                <w:color w:val="000000"/>
-                <w:sz w:val="17"/>
-                <w:szCs w:val="17"/>
-              </w:rPr>
-              <w:t>DECIMAL(5,2)</w:t>
+            <w:proofErr w:type="gramStart"/>
+            <w:r>
+              <w:rPr>
+                <w:color w:val="000000"/>
+                <w:sz w:val="17"/>
+                <w:szCs w:val="17"/>
+              </w:rPr>
+              <w:t>DECIMAL(</w:t>
+            </w:r>
+            <w:proofErr w:type="gramEnd"/>
+            <w:r>
+              <w:rPr>
+                <w:color w:val="000000"/>
+                <w:sz w:val="17"/>
+                <w:szCs w:val="17"/>
+              </w:rPr>
+              <w:t>5,2)</w:t>
             </w:r>
           </w:p>
         </w:tc>
@@ -34147,12 +34166,6 @@
         </w:tc>
       </w:tr>
       <w:tr>
-        <w:tblPrEx>
-          <w:tblCellMar>
-            <w:top w:w="0" w:type="dxa"/>
-            <w:bottom w:w="0" w:type="dxa"/>
-          </w:tblCellMar>
-        </w:tblPrEx>
         <w:tc>
           <w:tcPr>
             <w:tcW w:w="2350" w:type="dxa"/>
@@ -34300,7 +34313,27 @@
           <w:szCs w:val="18"/>
         </w:rPr>
         <w:lastRenderedPageBreak/>
-        <w:t>Puntaje obtenido en cada criterio. Proviene de la relación M:N entre evaluación y criterio, por lo que su clave primaria es compuesta.</w:t>
+        <w:t xml:space="preserve">Puntaje obtenido en cada criterio. Proviene de la relación </w:t>
+      </w:r>
+      <w:proofErr w:type="gramStart"/>
+      <w:r>
+        <w:rPr>
+          <w:i/>
+          <w:iCs/>
+          <w:sz w:val="18"/>
+          <w:szCs w:val="18"/>
+        </w:rPr>
+        <w:t>M:N</w:t>
+      </w:r>
+      <w:proofErr w:type="gramEnd"/>
+      <w:r>
+        <w:rPr>
+          <w:i/>
+          <w:iCs/>
+          <w:sz w:val="18"/>
+          <w:szCs w:val="18"/>
+        </w:rPr>
+        <w:t xml:space="preserve"> entre evaluación y criterio, por lo que su clave primaria es compuesta.</w:t>
       </w:r>
     </w:p>
     <w:tbl>
@@ -34328,12 +34361,6 @@
         <w:gridCol w:w="3560"/>
       </w:tblGrid>
       <w:tr>
-        <w:tblPrEx>
-          <w:tblCellMar>
-            <w:top w:w="0" w:type="dxa"/>
-            <w:bottom w:w="0" w:type="dxa"/>
-          </w:tblCellMar>
-        </w:tblPrEx>
         <w:trPr>
           <w:tblHeader/>
         </w:trPr>
@@ -34465,12 +34492,6 @@
         </w:tc>
       </w:tr>
       <w:tr>
-        <w:tblPrEx>
-          <w:tblCellMar>
-            <w:top w:w="0" w:type="dxa"/>
-            <w:bottom w:w="0" w:type="dxa"/>
-          </w:tblCellMar>
-        </w:tblPrEx>
         <w:tc>
           <w:tcPr>
             <w:tcW w:w="2350" w:type="dxa"/>
@@ -34586,12 +34607,6 @@
         </w:tc>
       </w:tr>
       <w:tr>
-        <w:tblPrEx>
-          <w:tblCellMar>
-            <w:top w:w="0" w:type="dxa"/>
-            <w:bottom w:w="0" w:type="dxa"/>
-          </w:tblCellMar>
-        </w:tblPrEx>
         <w:tc>
           <w:tcPr>
             <w:tcW w:w="2350" w:type="dxa"/>
@@ -34712,12 +34727,6 @@
         </w:tc>
       </w:tr>
       <w:tr>
-        <w:tblPrEx>
-          <w:tblCellMar>
-            <w:top w:w="0" w:type="dxa"/>
-            <w:bottom w:w="0" w:type="dxa"/>
-          </w:tblCellMar>
-        </w:tblPrEx>
         <w:tc>
           <w:tcPr>
             <w:tcW w:w="2350" w:type="dxa"/>
@@ -34750,13 +34759,23 @@
             </w:tcMar>
           </w:tcPr>
           <w:p>
-            <w:r>
-              <w:rPr>
-                <w:color w:val="000000"/>
-                <w:sz w:val="17"/>
-                <w:szCs w:val="17"/>
-              </w:rPr>
-              <w:t>DECIMAL(5,2)</w:t>
+            <w:proofErr w:type="gramStart"/>
+            <w:r>
+              <w:rPr>
+                <w:color w:val="000000"/>
+                <w:sz w:val="17"/>
+                <w:szCs w:val="17"/>
+              </w:rPr>
+              <w:t>DECIMAL(</w:t>
+            </w:r>
+            <w:proofErr w:type="gramEnd"/>
+            <w:r>
+              <w:rPr>
+                <w:color w:val="000000"/>
+                <w:sz w:val="17"/>
+                <w:szCs w:val="17"/>
+              </w:rPr>
+              <w:t>5,2)</w:t>
             </w:r>
           </w:p>
         </w:tc>
@@ -34831,12 +34850,6 @@
         </w:tc>
       </w:tr>
       <w:tr>
-        <w:tblPrEx>
-          <w:tblCellMar>
-            <w:top w:w="0" w:type="dxa"/>
-            <w:bottom w:w="0" w:type="dxa"/>
-          </w:tblCellMar>
-        </w:tblPrEx>
         <w:tc>
           <w:tcPr>
             <w:tcW w:w="2350" w:type="dxa"/>
@@ -34978,7 +34991,10 @@
         <w:jc w:val="both"/>
       </w:pPr>
       <w:r>
-        <w:t>Como parte del trabajo de la fase de diseño, y para validar con los actores la comprensión del proceso levantado, se construyó un prototipo de mediana fidelidad del panel del estudiante practicante, que es el actor con la interacción más frecuente con el sistema. El prototipo no constituye un objetivo del proyecto: es un instrumento de diseño que permite discutir los flujos antes de construirlos. Las cinco pantallas comparten el mismo menú lateral, de modo que el practicante conserva siempre la visibilidad de las secciones de su panel.</w:t>
+        <w:t xml:space="preserve">Como parte del trabajo de la fase de diseño, y para validar con los actores la comprensión del proceso levantado, se construyó un prototipo de mediana fidelidad del panel del estudiante practicante, que es el actor con la interacción más frecuente con el sistema. El prototipo no constituye un objetivo del proyecto: es un instrumento de diseño que permite discutir los flujos antes de construirlos. Las cinco pantallas comparten el mismo menú lateral, de modo que el practicante conserva siempre la visibilidad </w:t>
+      </w:r>
+      <w:r>
+        <w:t>de las secciones de su panel.</w:t>
       </w:r>
     </w:p>
     <w:p>
@@ -35488,36 +35504,6 @@
           <w:szCs w:val="20"/>
         </w:rPr>
         <w:t>https://github.com/rcarreno4-dot/Proyecto-integrador-5</w:t>
-      </w:r>
-    </w:p>
-    <w:p>
-      <w:pPr>
-        <w:spacing w:after="140"/>
-        <w:jc w:val="both"/>
-      </w:pPr>
-      <w:r>
-        <w:t xml:space="preserve">La documentación de esta primera entrega se encuentra en la carpeta </w:t>
-      </w:r>
-      <w:proofErr w:type="spellStart"/>
-      <w:r>
-        <w:t>Primera_entrega</w:t>
-      </w:r>
-      <w:proofErr w:type="spellEnd"/>
-      <w:r>
-        <w:t>:</w:t>
-      </w:r>
-    </w:p>
-    <w:p>
-      <w:pPr>
-        <w:spacing w:after="140"/>
-      </w:pPr>
-      <w:r>
-        <w:rPr>
-          <w:color w:val="1155CC"/>
-          <w:sz w:val="20"/>
-          <w:szCs w:val="20"/>
-        </w:rPr>
-        <w:t>https://github.com/rcarreno4-dot/Proyecto-integrador-5/tree/main/Primera_entrega</w:t>
       </w:r>
     </w:p>
     <w:p>
@@ -36827,6 +36813,7 @@
   <w:style w:type="character" w:default="1" w:styleId="Fuentedeprrafopredeter">
     <w:name w:val="Default Paragraph Font"/>
     <w:uiPriority w:val="1"/>
+    <w:semiHidden/>
     <w:unhideWhenUsed/>
   </w:style>
   <w:style w:type="table" w:default="1" w:styleId="Tablanormal">

</xml_diff>